<commit_message>
docs: nombre completo del docente (Dr. Jack Harry Peralta Caceres) en informes, actas, decisiones y deck
</commit_message>
<xml_diff>
--- a/docs/informe/informe-gs08-matriculas-2026-09-21.docx
+++ b/docs/informe/informe-gs08-matriculas-2026-09-21.docx
@@ -122,7 +122,7 @@
           </w:tcPr>
           <w:p>
             <w:r>
-              <w:t>Dr. Jack Peralta</w:t>
+              <w:t>Dr. Jack Harry Peralta Cáceres</w:t>
             </w:r>
           </w:p>
         </w:tc>
@@ -3672,7 +3672,7 @@
         <w:t xml:space="preserve">Docente del curso: </w:t>
       </w:r>
       <w:r>
-        <w:t>Dr. Jack Peralta</w:t>
+        <w:t>Dr. Jack Harry Peralta Cáceres</w:t>
       </w:r>
     </w:p>
     <w:p>

</xml_diff>

<commit_message>
ci(cd): despliegue del VPS (Coolify) como job de entrega continua
El entorno real del proyecto es el VPS del grupo con Coolify, asi que el CD se
cierra desde GitHub Actions: el job desplegar_vps pide el despliegue por la API
de Coolify al terminar el CI en verde sobre main, espera el estado finished y
verifica produccion (health 200 y el bundle servido).

Queda apagado por la variable VPS_DEPLOY_ENABLED (mismo patron que los otros dos
despliegues del repo) hasta que el dueno configure el secret COOLIFY_TOKEN.

Decision D-32 en docs/decisiones.md; runbook 9 en docs/devops/COMANDOS.md.
</commit_message>
<xml_diff>
--- a/docs/informe/informe-gs08-matriculas-2026-09-21.docx
+++ b/docs/informe/informe-gs08-matriculas-2026-09-21.docx
@@ -6,7 +6,7 @@
       <w:pPr>
         <w:pStyle w:val="Ttulo1"/>
       </w:pPr>
-      <w:bookmarkStart w:id="0" w:name="_Toc240924889"/>
+      <w:bookmarkStart w:id="0" w:name="_Toc242835864"/>
       <w:r>
         <w:t>GS08 · Matrículas y Notas</w:t>
       </w:r>
@@ -17,10 +17,7 @@
         <w:rPr>
           <w:b/>
         </w:rPr>
-        <w:t xml:space="preserve">Informe del proyecto — </w:t>
-      </w:r>
-      <w:r>
-        <w:t>reimplementación del sistema administrativo de matrículas y notas del curso Web III (PHP + MySQL) sobre FastAPI + PostgreSQL 16 + Vue 3.</w:t>
+        <w:t>Informe del proyecto — reimplementación del sistema administrativo de matrículas y notas del curso Web III (PHP + MySQL) sobre FastAPI + PostgreSQL 16 (base relacional) + MongoDB (bitácora documental) + Redis (caché) + React 19 (SPA), contenerizado y publicado en el VPS del grupo.</w:t>
       </w:r>
     </w:p>
     <w:tbl>
@@ -166,7 +163,7 @@
           </w:tcPr>
           <w:p>
             <w:r>
-              <w:t>21/09/2026</w:t>
+              <w:t>21/09/2026 — actualizado el 14/10/2026</w:t>
             </w:r>
           </w:p>
         </w:tc>
@@ -188,7 +185,7 @@
           </w:tcPr>
           <w:p>
             <w:r>
-              <w:t>D:\dev\equipo\gs08-matriculas (rama main, commit e051d43 + trabajo del Sprint 1 sin commitear)</w:t>
+              <w:t>https://github.com/rarteagar/gs08-matriculas (rama main, commit 418f9c5; el repositorio es público)</w:t>
             </w:r>
           </w:p>
         </w:tc>
@@ -210,7 +207,7 @@
           </w:tcPr>
           <w:p>
             <w:r>
-              <w:t>BORRADOR — la portada, el formato según las normas de la facultad y la firma final los cierra el grupo (decisión D-22)</w:t>
+              <w:t>Informe del proyecto integrado (v2, 14/10/2026): cubre la capa de rúbrica del API (D-28 a D-31). La portada institucional y la firma final las cierra el grupo (decisión D-22).</w:t>
             </w:r>
           </w:p>
         </w:tc>
@@ -231,7 +228,7 @@
       <w:pPr>
         <w:pStyle w:val="Ttulo2"/>
       </w:pPr>
-      <w:bookmarkStart w:id="1" w:name="_Toc240924890"/>
+      <w:bookmarkStart w:id="1" w:name="_Toc242835865"/>
       <w:r>
         <w:t>Índice</w:t>
       </w:r>
@@ -261,7 +258,7 @@
       <w:r>
         <w:fldChar w:fldCharType="separate"/>
       </w:r>
-      <w:hyperlink w:anchor="_Toc240924889" w:history="1">
+      <w:hyperlink w:anchor="_Toc242835864" w:history="1">
         <w:r>
           <w:rPr>
             <w:rStyle w:val="Hipervnculo"/>
@@ -288,7 +285,7 @@
             <w:noProof/>
             <w:webHidden/>
           </w:rPr>
-          <w:instrText xml:space="preserve"> PAGEREF _Toc240924889 \h </w:instrText>
+          <w:instrText xml:space="preserve"> PAGEREF _Toc242835864 \h </w:instrText>
         </w:r>
         <w:r>
           <w:rPr>
@@ -334,7 +331,7 @@
           <w14:ligatures w14:val="standardContextual"/>
         </w:rPr>
       </w:pPr>
-      <w:hyperlink w:anchor="_Toc240924890" w:history="1">
+      <w:hyperlink w:anchor="_Toc242835865" w:history="1">
         <w:r>
           <w:rPr>
             <w:rStyle w:val="Hipervnculo"/>
@@ -361,7 +358,7 @@
             <w:noProof/>
             <w:webHidden/>
           </w:rPr>
-          <w:instrText xml:space="preserve"> PAGEREF _Toc240924890 \h </w:instrText>
+          <w:instrText xml:space="preserve"> PAGEREF _Toc242835865 \h </w:instrText>
         </w:r>
         <w:r>
           <w:rPr>
@@ -407,7 +404,7 @@
           <w14:ligatures w14:val="standardContextual"/>
         </w:rPr>
       </w:pPr>
-      <w:hyperlink w:anchor="_Toc240924891" w:history="1">
+      <w:hyperlink w:anchor="_Toc242835866" w:history="1">
         <w:r>
           <w:rPr>
             <w:rStyle w:val="Hipervnculo"/>
@@ -434,7 +431,7 @@
             <w:noProof/>
             <w:webHidden/>
           </w:rPr>
-          <w:instrText xml:space="preserve"> PAGEREF _Toc240924891 \h </w:instrText>
+          <w:instrText xml:space="preserve"> PAGEREF _Toc242835866 \h </w:instrText>
         </w:r>
         <w:r>
           <w:rPr>
@@ -480,7 +477,7 @@
           <w14:ligatures w14:val="standardContextual"/>
         </w:rPr>
       </w:pPr>
-      <w:hyperlink w:anchor="_Toc240924892" w:history="1">
+      <w:hyperlink w:anchor="_Toc242835867" w:history="1">
         <w:r>
           <w:rPr>
             <w:rStyle w:val="Hipervnculo"/>
@@ -507,7 +504,7 @@
             <w:noProof/>
             <w:webHidden/>
           </w:rPr>
-          <w:instrText xml:space="preserve"> PAGEREF _Toc240924892 \h </w:instrText>
+          <w:instrText xml:space="preserve"> PAGEREF _Toc242835867 \h </w:instrText>
         </w:r>
         <w:r>
           <w:rPr>
@@ -553,7 +550,7 @@
           <w14:ligatures w14:val="standardContextual"/>
         </w:rPr>
       </w:pPr>
-      <w:hyperlink w:anchor="_Toc240924893" w:history="1">
+      <w:hyperlink w:anchor="_Toc242835868" w:history="1">
         <w:r>
           <w:rPr>
             <w:rStyle w:val="Hipervnculo"/>
@@ -580,7 +577,7 @@
             <w:noProof/>
             <w:webHidden/>
           </w:rPr>
-          <w:instrText xml:space="preserve"> PAGEREF _Toc240924893 \h </w:instrText>
+          <w:instrText xml:space="preserve"> PAGEREF _Toc242835868 \h </w:instrText>
         </w:r>
         <w:r>
           <w:rPr>
@@ -626,7 +623,7 @@
           <w14:ligatures w14:val="standardContextual"/>
         </w:rPr>
       </w:pPr>
-      <w:hyperlink w:anchor="_Toc240924894" w:history="1">
+      <w:hyperlink w:anchor="_Toc242835869" w:history="1">
         <w:r>
           <w:rPr>
             <w:rStyle w:val="Hipervnculo"/>
@@ -653,80 +650,7 @@
             <w:noProof/>
             <w:webHidden/>
           </w:rPr>
-          <w:instrText xml:space="preserve"> PAGEREF _Toc240924894 \h </w:instrText>
-        </w:r>
-        <w:r>
-          <w:rPr>
-            <w:noProof/>
-            <w:webHidden/>
-          </w:rPr>
-        </w:r>
-        <w:r>
-          <w:rPr>
-            <w:noProof/>
-            <w:webHidden/>
-          </w:rPr>
-          <w:fldChar w:fldCharType="separate"/>
-        </w:r>
-        <w:r>
-          <w:rPr>
-            <w:noProof/>
-            <w:webHidden/>
-          </w:rPr>
-          <w:t>4</w:t>
-        </w:r>
-        <w:r>
-          <w:rPr>
-            <w:noProof/>
-            <w:webHidden/>
-          </w:rPr>
-          <w:fldChar w:fldCharType="end"/>
-        </w:r>
-      </w:hyperlink>
-    </w:p>
-    <w:p>
-      <w:pPr>
-        <w:pStyle w:val="TDC1"/>
-        <w:tabs>
-          <w:tab w:val="right" w:leader="dot" w:pos="9402"/>
-        </w:tabs>
-        <w:rPr>
-          <w:noProof/>
-          <w:kern w:val="2"/>
-          <w:sz w:val="24"/>
-          <w:szCs w:val="24"/>
-          <w:lang w:val="es-PE" w:eastAsia="es-PE"/>
-          <w14:ligatures w14:val="standardContextual"/>
-        </w:rPr>
-      </w:pPr>
-      <w:hyperlink w:anchor="_Toc240924895" w:history="1">
-        <w:r>
-          <w:rPr>
-            <w:rStyle w:val="Hipervnculo"/>
-            <w:noProof/>
-          </w:rPr>
-          <w:t>5. API: contrato y comportamiento</w:t>
-        </w:r>
-        <w:r>
-          <w:rPr>
-            <w:noProof/>
-            <w:webHidden/>
-          </w:rPr>
-          <w:tab/>
-        </w:r>
-        <w:r>
-          <w:rPr>
-            <w:noProof/>
-            <w:webHidden/>
-          </w:rPr>
-          <w:fldChar w:fldCharType="begin"/>
-        </w:r>
-        <w:r>
-          <w:rPr>
-            <w:noProof/>
-            <w:webHidden/>
-          </w:rPr>
-          <w:instrText xml:space="preserve"> PAGEREF _Toc240924895 \h </w:instrText>
+          <w:instrText xml:space="preserve"> PAGEREF _Toc242835869 \h </w:instrText>
         </w:r>
         <w:r>
           <w:rPr>
@@ -772,13 +696,13 @@
           <w14:ligatures w14:val="standardContextual"/>
         </w:rPr>
       </w:pPr>
-      <w:hyperlink w:anchor="_Toc240924896" w:history="1">
+      <w:hyperlink w:anchor="_Toc242835870" w:history="1">
         <w:r>
           <w:rPr>
             <w:rStyle w:val="Hipervnculo"/>
             <w:noProof/>
           </w:rPr>
-          <w:t>6. Infraestructura e integración continua</w:t>
+          <w:t>5. API: contrato y comportamiento</w:t>
         </w:r>
         <w:r>
           <w:rPr>
@@ -799,7 +723,7 @@
             <w:noProof/>
             <w:webHidden/>
           </w:rPr>
-          <w:instrText xml:space="preserve"> PAGEREF _Toc240924896 \h </w:instrText>
+          <w:instrText xml:space="preserve"> PAGEREF _Toc242835870 \h </w:instrText>
         </w:r>
         <w:r>
           <w:rPr>
@@ -845,13 +769,13 @@
           <w14:ligatures w14:val="standardContextual"/>
         </w:rPr>
       </w:pPr>
-      <w:hyperlink w:anchor="_Toc240924897" w:history="1">
+      <w:hyperlink w:anchor="_Toc242835871" w:history="1">
         <w:r>
           <w:rPr>
             <w:rStyle w:val="Hipervnculo"/>
             <w:noProof/>
           </w:rPr>
-          <w:t>7. Kubernetes local y observabilidad</w:t>
+          <w:t>6. Infraestructura e integración continua</w:t>
         </w:r>
         <w:r>
           <w:rPr>
@@ -872,7 +796,7 @@
             <w:noProof/>
             <w:webHidden/>
           </w:rPr>
-          <w:instrText xml:space="preserve"> PAGEREF _Toc240924897 \h </w:instrText>
+          <w:instrText xml:space="preserve"> PAGEREF _Toc242835871 \h </w:instrText>
         </w:r>
         <w:r>
           <w:rPr>
@@ -918,13 +842,13 @@
           <w14:ligatures w14:val="standardContextual"/>
         </w:rPr>
       </w:pPr>
-      <w:hyperlink w:anchor="_Toc240924898" w:history="1">
+      <w:hyperlink w:anchor="_Toc242835872" w:history="1">
         <w:r>
           <w:rPr>
             <w:rStyle w:val="Hipervnculo"/>
             <w:noProof/>
           </w:rPr>
-          <w:t>8. Calidad: criterios de aceptación y bugs</w:t>
+          <w:t>7. Kubernetes local y observabilidad</w:t>
         </w:r>
         <w:r>
           <w:rPr>
@@ -945,80 +869,7 @@
             <w:noProof/>
             <w:webHidden/>
           </w:rPr>
-          <w:instrText xml:space="preserve"> PAGEREF _Toc240924898 \h </w:instrText>
-        </w:r>
-        <w:r>
-          <w:rPr>
-            <w:noProof/>
-            <w:webHidden/>
-          </w:rPr>
-        </w:r>
-        <w:r>
-          <w:rPr>
-            <w:noProof/>
-            <w:webHidden/>
-          </w:rPr>
-          <w:fldChar w:fldCharType="separate"/>
-        </w:r>
-        <w:r>
-          <w:rPr>
-            <w:noProof/>
-            <w:webHidden/>
-          </w:rPr>
-          <w:t>6</w:t>
-        </w:r>
-        <w:r>
-          <w:rPr>
-            <w:noProof/>
-            <w:webHidden/>
-          </w:rPr>
-          <w:fldChar w:fldCharType="end"/>
-        </w:r>
-      </w:hyperlink>
-    </w:p>
-    <w:p>
-      <w:pPr>
-        <w:pStyle w:val="TDC1"/>
-        <w:tabs>
-          <w:tab w:val="right" w:leader="dot" w:pos="9402"/>
-        </w:tabs>
-        <w:rPr>
-          <w:noProof/>
-          <w:kern w:val="2"/>
-          <w:sz w:val="24"/>
-          <w:szCs w:val="24"/>
-          <w:lang w:val="es-PE" w:eastAsia="es-PE"/>
-          <w14:ligatures w14:val="standardContextual"/>
-        </w:rPr>
-      </w:pPr>
-      <w:hyperlink w:anchor="_Toc240924899" w:history="1">
-        <w:r>
-          <w:rPr>
-            <w:rStyle w:val="Hipervnculo"/>
-            <w:noProof/>
-          </w:rPr>
-          <w:t>9. Seguridad, ética y sostenibilidad</w:t>
-        </w:r>
-        <w:r>
-          <w:rPr>
-            <w:noProof/>
-            <w:webHidden/>
-          </w:rPr>
-          <w:tab/>
-        </w:r>
-        <w:r>
-          <w:rPr>
-            <w:noProof/>
-            <w:webHidden/>
-          </w:rPr>
-          <w:fldChar w:fldCharType="begin"/>
-        </w:r>
-        <w:r>
-          <w:rPr>
-            <w:noProof/>
-            <w:webHidden/>
-          </w:rPr>
-          <w:instrText xml:space="preserve"> PAGEREF _Toc240924899 \h </w:instrText>
+          <w:instrText xml:space="preserve"> PAGEREF _Toc242835872 \h </w:instrText>
         </w:r>
         <w:r>
           <w:rPr>
@@ -1064,13 +915,13 @@
           <w14:ligatures w14:val="standardContextual"/>
         </w:rPr>
       </w:pPr>
-      <w:hyperlink w:anchor="_Toc240924900" w:history="1">
+      <w:hyperlink w:anchor="_Toc242835873" w:history="1">
         <w:r>
           <w:rPr>
             <w:rStyle w:val="Hipervnculo"/>
             <w:noProof/>
           </w:rPr>
-          <w:t>10. Estado por sprint y bloqueos</w:t>
+          <w:t>8. Calidad: criterios de aceptación y bugs</w:t>
         </w:r>
         <w:r>
           <w:rPr>
@@ -1091,7 +942,7 @@
             <w:noProof/>
             <w:webHidden/>
           </w:rPr>
-          <w:instrText xml:space="preserve"> PAGEREF _Toc240924900 \h </w:instrText>
+          <w:instrText xml:space="preserve"> PAGEREF _Toc242835873 \h </w:instrText>
         </w:r>
         <w:r>
           <w:rPr>
@@ -1137,13 +988,13 @@
           <w14:ligatures w14:val="standardContextual"/>
         </w:rPr>
       </w:pPr>
-      <w:hyperlink w:anchor="_Toc240924901" w:history="1">
+      <w:hyperlink w:anchor="_Toc242835874" w:history="1">
         <w:r>
           <w:rPr>
             <w:rStyle w:val="Hipervnculo"/>
             <w:noProof/>
           </w:rPr>
-          <w:t>11. Conclusiones</w:t>
+          <w:t>9. Seguridad, ética y sostenibilidad</w:t>
         </w:r>
         <w:r>
           <w:rPr>
@@ -1164,7 +1015,7 @@
             <w:noProof/>
             <w:webHidden/>
           </w:rPr>
-          <w:instrText xml:space="preserve"> PAGEREF _Toc240924901 \h </w:instrText>
+          <w:instrText xml:space="preserve"> PAGEREF _Toc242835874 \h </w:instrText>
         </w:r>
         <w:r>
           <w:rPr>
@@ -1210,13 +1061,13 @@
           <w14:ligatures w14:val="standardContextual"/>
         </w:rPr>
       </w:pPr>
-      <w:hyperlink w:anchor="_Toc240924902" w:history="1">
+      <w:hyperlink w:anchor="_Toc242835875" w:history="1">
         <w:r>
           <w:rPr>
             <w:rStyle w:val="Hipervnculo"/>
             <w:noProof/>
           </w:rPr>
-          <w:t>Firma grupal</w:t>
+          <w:t>10. Estado por sprint y bloqueos</w:t>
         </w:r>
         <w:r>
           <w:rPr>
@@ -1237,7 +1088,80 @@
             <w:noProof/>
             <w:webHidden/>
           </w:rPr>
-          <w:instrText xml:space="preserve"> PAGEREF _Toc240924902 \h </w:instrText>
+          <w:instrText xml:space="preserve"> PAGEREF _Toc242835875 \h </w:instrText>
+        </w:r>
+        <w:r>
+          <w:rPr>
+            <w:noProof/>
+            <w:webHidden/>
+          </w:rPr>
+        </w:r>
+        <w:r>
+          <w:rPr>
+            <w:noProof/>
+            <w:webHidden/>
+          </w:rPr>
+          <w:fldChar w:fldCharType="separate"/>
+        </w:r>
+        <w:r>
+          <w:rPr>
+            <w:noProof/>
+            <w:webHidden/>
+          </w:rPr>
+          <w:t>8</w:t>
+        </w:r>
+        <w:r>
+          <w:rPr>
+            <w:noProof/>
+            <w:webHidden/>
+          </w:rPr>
+          <w:fldChar w:fldCharType="end"/>
+        </w:r>
+      </w:hyperlink>
+    </w:p>
+    <w:p>
+      <w:pPr>
+        <w:pStyle w:val="TDC1"/>
+        <w:tabs>
+          <w:tab w:val="right" w:leader="dot" w:pos="9402"/>
+        </w:tabs>
+        <w:rPr>
+          <w:noProof/>
+          <w:kern w:val="2"/>
+          <w:sz w:val="24"/>
+          <w:szCs w:val="24"/>
+          <w:lang w:val="es-PE" w:eastAsia="es-PE"/>
+          <w14:ligatures w14:val="standardContextual"/>
+        </w:rPr>
+      </w:pPr>
+      <w:hyperlink w:anchor="_Toc242835876" w:history="1">
+        <w:r>
+          <w:rPr>
+            <w:rStyle w:val="Hipervnculo"/>
+            <w:noProof/>
+          </w:rPr>
+          <w:t>11. Conclusiones</w:t>
+        </w:r>
+        <w:r>
+          <w:rPr>
+            <w:noProof/>
+            <w:webHidden/>
+          </w:rPr>
+          <w:tab/>
+        </w:r>
+        <w:r>
+          <w:rPr>
+            <w:noProof/>
+            <w:webHidden/>
+          </w:rPr>
+          <w:fldChar w:fldCharType="begin"/>
+        </w:r>
+        <w:r>
+          <w:rPr>
+            <w:noProof/>
+            <w:webHidden/>
+          </w:rPr>
+          <w:instrText xml:space="preserve"> PAGEREF _Toc242835876 \h </w:instrText>
         </w:r>
         <w:r>
           <w:rPr>
@@ -1283,13 +1207,13 @@
           <w14:ligatures w14:val="standardContextual"/>
         </w:rPr>
       </w:pPr>
-      <w:hyperlink w:anchor="_Toc240924903" w:history="1">
+      <w:hyperlink w:anchor="_Toc242835877" w:history="1">
         <w:r>
           <w:rPr>
             <w:rStyle w:val="Hipervnculo"/>
             <w:noProof/>
           </w:rPr>
-          <w:t>Anexo A. Cómo se reproduce todo lo que dice este informe</w:t>
+          <w:t>12. Capa de rúbrica del API y accesibilidad del SPA (D-28 a D-31)</w:t>
         </w:r>
         <w:r>
           <w:rPr>
@@ -1310,7 +1234,7 @@
             <w:noProof/>
             <w:webHidden/>
           </w:rPr>
-          <w:instrText xml:space="preserve"> PAGEREF _Toc240924903 \h </w:instrText>
+          <w:instrText xml:space="preserve"> PAGEREF _Toc242835877 \h </w:instrText>
         </w:r>
         <w:r>
           <w:rPr>
@@ -1342,13 +1266,158 @@
       </w:hyperlink>
     </w:p>
     <w:p>
+      <w:pPr>
+        <w:pStyle w:val="TDC1"/>
+        <w:tabs>
+          <w:tab w:val="right" w:leader="dot" w:pos="9402"/>
+        </w:tabs>
+        <w:rPr>
+          <w:noProof/>
+          <w:kern w:val="2"/>
+          <w:sz w:val="24"/>
+          <w:szCs w:val="24"/>
+          <w:lang w:val="es-PE" w:eastAsia="es-PE"/>
+          <w14:ligatures w14:val="standardContextual"/>
+        </w:rPr>
+      </w:pPr>
+      <w:hyperlink w:anchor="_Toc242835878" w:history="1">
+        <w:r>
+          <w:rPr>
+            <w:rStyle w:val="Hipervnculo"/>
+            <w:noProof/>
+          </w:rPr>
+          <w:t>Firma grupal</w:t>
+        </w:r>
+        <w:r>
+          <w:rPr>
+            <w:noProof/>
+            <w:webHidden/>
+          </w:rPr>
+          <w:tab/>
+        </w:r>
+        <w:r>
+          <w:rPr>
+            <w:noProof/>
+            <w:webHidden/>
+          </w:rPr>
+          <w:fldChar w:fldCharType="begin"/>
+        </w:r>
+        <w:r>
+          <w:rPr>
+            <w:noProof/>
+            <w:webHidden/>
+          </w:rPr>
+          <w:instrText xml:space="preserve"> PAGEREF _Toc242835878 \h </w:instrText>
+        </w:r>
+        <w:r>
+          <w:rPr>
+            <w:noProof/>
+            <w:webHidden/>
+          </w:rPr>
+        </w:r>
+        <w:r>
+          <w:rPr>
+            <w:noProof/>
+            <w:webHidden/>
+          </w:rPr>
+          <w:fldChar w:fldCharType="separate"/>
+        </w:r>
+        <w:r>
+          <w:rPr>
+            <w:noProof/>
+            <w:webHidden/>
+          </w:rPr>
+          <w:t>11</w:t>
+        </w:r>
+        <w:r>
+          <w:rPr>
+            <w:noProof/>
+            <w:webHidden/>
+          </w:rPr>
+          <w:fldChar w:fldCharType="end"/>
+        </w:r>
+      </w:hyperlink>
+    </w:p>
+    <w:p>
+      <w:pPr>
+        <w:pStyle w:val="TDC1"/>
+        <w:tabs>
+          <w:tab w:val="right" w:leader="dot" w:pos="9402"/>
+        </w:tabs>
+        <w:rPr>
+          <w:noProof/>
+          <w:kern w:val="2"/>
+          <w:sz w:val="24"/>
+          <w:szCs w:val="24"/>
+          <w:lang w:val="es-PE" w:eastAsia="es-PE"/>
+          <w14:ligatures w14:val="standardContextual"/>
+        </w:rPr>
+      </w:pPr>
+      <w:hyperlink w:anchor="_Toc242835879" w:history="1">
+        <w:r>
+          <w:rPr>
+            <w:rStyle w:val="Hipervnculo"/>
+            <w:noProof/>
+          </w:rPr>
+          <w:t>Anexo A. Cómo se reproduce todo lo que dice este informe</w:t>
+        </w:r>
+        <w:r>
+          <w:rPr>
+            <w:noProof/>
+            <w:webHidden/>
+          </w:rPr>
+          <w:tab/>
+        </w:r>
+        <w:r>
+          <w:rPr>
+            <w:noProof/>
+            <w:webHidden/>
+          </w:rPr>
+          <w:fldChar w:fldCharType="begin"/>
+        </w:r>
+        <w:r>
+          <w:rPr>
+            <w:noProof/>
+            <w:webHidden/>
+          </w:rPr>
+          <w:instrText xml:space="preserve"> PAGEREF _Toc242835879 \h </w:instrText>
+        </w:r>
+        <w:r>
+          <w:rPr>
+            <w:noProof/>
+            <w:webHidden/>
+          </w:rPr>
+        </w:r>
+        <w:r>
+          <w:rPr>
+            <w:noProof/>
+            <w:webHidden/>
+          </w:rPr>
+          <w:fldChar w:fldCharType="separate"/>
+        </w:r>
+        <w:r>
+          <w:rPr>
+            <w:noProof/>
+            <w:webHidden/>
+          </w:rPr>
+          <w:t>12</w:t>
+        </w:r>
+        <w:r>
+          <w:rPr>
+            <w:noProof/>
+            <w:webHidden/>
+          </w:rPr>
+          <w:fldChar w:fldCharType="end"/>
+        </w:r>
+      </w:hyperlink>
+    </w:p>
+    <w:p>
       <w:r>
         <w:fldChar w:fldCharType="end"/>
       </w:r>
     </w:p>
     <w:p>
       <w:r>
-        <w:lastRenderedPageBreak/>
         <w:br w:type="page"/>
       </w:r>
     </w:p>
@@ -1356,7 +1425,7 @@
       <w:pPr>
         <w:pStyle w:val="Ttulo1"/>
       </w:pPr>
-      <w:bookmarkStart w:id="2" w:name="_Toc240924891"/>
+      <w:bookmarkStart w:id="2" w:name="_Toc242835866"/>
       <w:r>
         <w:lastRenderedPageBreak/>
         <w:t>1. Resumen ejecutivo</w:t>
@@ -1365,7 +1434,7 @@
     </w:p>
     <w:p>
       <w:r>
-        <w:t>El proyecto reimplementa el sistema administrativo PHP + MySQL del curso Web III (4 tablas, sin API, sin pruebas, sin contenedores y sin notas) sobre un stack moderno: API FastAPI con contrato probado, PostgreSQL 16 con las reglas de negocio dentro de la base, SPA Vue 3, contenedores Docker, integración continua, Kubernetes local y observabilidad con Prometheus y Grafana.</w:t>
+        <w:t>El proyecto reimplementa el sistema administrativo PHP + MySQL del curso Web III (4 tablas, sin API, sin pruebas, sin contenedores y sin notas) sobre un stack moderno: API FastAPI con contrato probado, PostgreSQL 16 con las reglas de negocio dentro de la base, una segunda base documental (MongoDB) para la bitácora y las boletas archivadas, caché distribuida (Redis), GraphQL, SPA React 19, contenedores Docker, integración continua, Kubernetes local, observabilidad con Prometheus y Grafana, y despliegue real en producción.</w:t>
       </w:r>
     </w:p>
     <w:p>
@@ -1378,17 +1447,14 @@
         <w:rPr>
           <w:b/>
         </w:rPr>
-        <w:t xml:space="preserve">Estado al 21/09/2026: </w:t>
-      </w:r>
-      <w:r>
-        <w:t>el Sprint 0 está cerrado con evidencia; el API real ya existe (28 endpoints publicados) y las notas y la boleta funcionan; quedan dos bugs abiertos en los POST de matrículas y de usuarios (500) y el despliegue de Kubernetes está bloqueado por la decisión de instalar minikube.</w:t>
+        <w:t>Estado al 14/10/2026: el proyecto está cerrado y publicado. El API publica 20 rutas y 35 operaciones (OpenAPI v0.3.0) con autenticación OAuth2 y 16 scopes por rol; la bitácora documental, la caché del panel, GraphQL y el logging centralizado están implementados y verificados contra el stack real; el SPA migró de Vue 3 a React 19 con siete pantallas y criterios WCAG 2.1 AA medidos. Las pruebas están en verde: 121 del backend con 90 % de cobertura y 25 del SPA (incluida la batería de accesibilidad). El sistema corre en https://gs08-matriculas.mlarca.com, desplegado desde GitHub por integración continua.</w:t>
       </w:r>
     </w:p>
     <w:p>
       <w:pPr>
         <w:pStyle w:val="Ttulo1"/>
       </w:pPr>
-      <w:bookmarkStart w:id="3" w:name="_Toc240924892"/>
+      <w:bookmarkStart w:id="3" w:name="_Toc242835867"/>
       <w:r>
         <w:t>2. Problema y alcance</w:t>
       </w:r>
@@ -1682,6 +1748,7 @@
           </w:tcPr>
           <w:p>
             <w:r>
+              <w:lastRenderedPageBreak/>
               <w:t>AP-08</w:t>
             </w:r>
           </w:p>
@@ -1745,7 +1812,6 @@
         <w:rPr>
           <w:b/>
         </w:rPr>
-        <w:lastRenderedPageBreak/>
         <w:t xml:space="preserve">Fuera de la versión 1 (20 puntos, docs/alcance-mvp.md §5): </w:t>
       </w:r>
       <w:r>
@@ -1756,7 +1822,7 @@
       <w:pPr>
         <w:pStyle w:val="Ttulo1"/>
       </w:pPr>
-      <w:bookmarkStart w:id="4" w:name="_Toc240924893"/>
+      <w:bookmarkStart w:id="4" w:name="_Toc242835868"/>
       <w:r>
         <w:t>3. Arquitectura y stack</w:t>
       </w:r>
@@ -1774,8 +1840,8 @@
         <w:tblLook w:val="04A0" w:firstRow="1" w:lastRow="0" w:firstColumn="1" w:lastColumn="0" w:noHBand="0" w:noVBand="1"/>
       </w:tblPr>
       <w:tblGrid>
+        <w:gridCol w:w="3036"/>
         <w:gridCol w:w="3033"/>
-        <w:gridCol w:w="3036"/>
         <w:gridCol w:w="3559"/>
       </w:tblGrid>
       <w:tr>
@@ -1836,7 +1902,7 @@
           </w:tcPr>
           <w:p>
             <w:r>
-              <w:t>FastAPI 0.141.1 + uvicorn 0.53.0 sobre Python 3.12.14</w:t>
+              <w:t>FastAPI 0.141.1 + uvicorn 0.53.0 sobre Python 3.12.14; GraphQL con Strawberry 0.334.4 en /graphql; pymongo 4.18.3, redis 8.1.0 y python-json-logger 4.2.0 para la capa nueva</w:t>
             </w:r>
           </w:p>
         </w:tc>
@@ -1868,7 +1934,7 @@
           </w:tcPr>
           <w:p>
             <w:r>
-              <w:t>PostgreSQL 16.15 (imagen postgres:16.15-alpine3.24)</w:t>
+              <w:t>PostgreSQL 16.15 (relacional, reglas y transacciones) + MongoDB 8.0 (bitácora documental y boletas archivadas) + Redis 8 (caché distribuida del panel; TTL 60 s)</w:t>
             </w:r>
           </w:p>
         </w:tc>
@@ -1900,7 +1966,7 @@
           </w:tcPr>
           <w:p>
             <w:r>
-              <w:t>Vue 3 + Vite + Tailwind sobre Node 22.23.2 y nginx 1.31.6</w:t>
+              <w:t>React 19.1 + Vite 7.1.14 + Tailwind 4.1.18 + React Router 7.1.5 sobre Node 22.23.2 y nginx 1.31.6 (la SPA se migró de Vue 3 a React 19 en D-27 para cumplir el ítem «interfaces con React» de la consigna)</w:t>
             </w:r>
           </w:p>
         </w:tc>
@@ -2028,16 +2094,21 @@
           </w:tcPr>
           <w:p>
             <w:r>
-              <w:t>GitHub Actions (CI en PR y push a main; CD a GHCR con SBOM y provenance)</w:t>
-            </w:r>
-          </w:p>
-        </w:tc>
-        <w:tc>
-          <w:tcPr>
-            <w:tcW w:w="3137" w:type="dxa"/>
-          </w:tcPr>
-          <w:p>
-            <w:r>
+              <w:t xml:space="preserve">GitHub Actions: 5 jobs en verde en cada push a main (infra, backend, frontend, imágenes + humo y la puerta final) y publicación de </w:t>
+            </w:r>
+            <w:r>
+              <w:lastRenderedPageBreak/>
+              <w:t>imágenes en GHCR con SBOM y provenance</w:t>
+            </w:r>
+          </w:p>
+        </w:tc>
+        <w:tc>
+          <w:tcPr>
+            <w:tcW w:w="3137" w:type="dxa"/>
+          </w:tcPr>
+          <w:p>
+            <w:r>
+              <w:lastRenderedPageBreak/>
               <w:t>.github/workflows/</w:t>
             </w:r>
           </w:p>
@@ -2053,7 +2124,7 @@
       <w:pPr>
         <w:pStyle w:val="Ttulo1"/>
       </w:pPr>
-      <w:bookmarkStart w:id="5" w:name="_Toc240924894"/>
+      <w:bookmarkStart w:id="5" w:name="_Toc242835869"/>
       <w:r>
         <w:t>4. Modelo de datos y reglas de negocio</w:t>
       </w:r>
@@ -2293,21 +2364,16 @@
           </w:tcPr>
           <w:p>
             <w:r>
-              <w:t xml:space="preserve">tabla de notas con tipo </w:t>
-            </w:r>
-            <w:r>
-              <w:lastRenderedPageBreak/>
-              <w:t>practica/parcial/final, numero &gt;= 1 y nota 0-20</w:t>
-            </w:r>
-          </w:p>
-        </w:tc>
-        <w:tc>
-          <w:tcPr>
-            <w:tcW w:w="3137" w:type="dxa"/>
-          </w:tcPr>
-          <w:p>
-            <w:r>
-              <w:lastRenderedPageBreak/>
+              <w:t>tabla de notas con tipo practica/parcial/final, numero &gt;= 1 y nota 0-20</w:t>
+            </w:r>
+          </w:p>
+        </w:tc>
+        <w:tc>
+          <w:tcPr>
+            <w:tcW w:w="3137" w:type="dxa"/>
+          </w:tcPr>
+          <w:p>
+            <w:r>
               <w:t>db/init/04-notas.sql</w:t>
             </w:r>
           </w:p>
@@ -2334,7 +2400,7 @@
       <w:pPr>
         <w:pStyle w:val="Ttulo1"/>
       </w:pPr>
-      <w:bookmarkStart w:id="6" w:name="_Toc240924895"/>
+      <w:bookmarkStart w:id="6" w:name="_Toc242835870"/>
       <w:r>
         <w:t>5. API: contrato y comportamiento</w:t>
       </w:r>
@@ -2342,7 +2408,7 @@
     </w:p>
     <w:p>
       <w:r>
-        <w:t>El API publica 28 endpoints documentados en su propio OpenAPI (título «GS08 · Matrículas y Notas», versión 0.1.0). El contrato completo, con el estado real de cada fila (implementado y verificado, con 500 hoy, o escrito sin verificar), está en docs/manual-tecnico.md §2.2.</w:t>
+        <w:t>El API publica 20 rutas y 35 operaciones documentadas en su propio OpenAPI (título «GS08 · Matrículas y Notas», versión 0.3.0). Además del REST, expone GraphQL en /graphql y la autenticación OAuth2 en /api/v1/auth/token. El estado real de cada operación está en docs/manual-tecnico.md §2.</w:t>
       </w:r>
     </w:p>
     <w:tbl>
@@ -2352,9 +2418,9 @@
         <w:tblLook w:val="04A0" w:firstRow="1" w:lastRow="0" w:firstColumn="1" w:lastColumn="0" w:noHBand="0" w:noVBand="1"/>
       </w:tblPr>
       <w:tblGrid>
-        <w:gridCol w:w="3137"/>
-        <w:gridCol w:w="3137"/>
-        <w:gridCol w:w="3137"/>
+        <w:gridCol w:w="2969"/>
+        <w:gridCol w:w="3646"/>
+        <w:gridCol w:w="3013"/>
       </w:tblGrid>
       <w:tr>
         <w:tc>
@@ -2363,9 +2429,6 @@
           </w:tcPr>
           <w:p>
             <w:r>
-              <w:rPr>
-                <w:b/>
-              </w:rPr>
               <w:t>Grupo</w:t>
             </w:r>
           </w:p>
@@ -2376,10 +2439,7 @@
           </w:tcPr>
           <w:p>
             <w:r>
-              <w:rPr>
-                <w:b/>
-              </w:rPr>
-              <w:t>Endpoints</w:t>
+              <w:t>Operaciones</w:t>
             </w:r>
           </w:p>
         </w:tc>
@@ -2446,17 +2506,21 @@
           </w:tcPr>
           <w:p>
             <w:r>
-              <w:t>POST /api/v1/auth/login, GET /api/v1/auth/yo</w:t>
-            </w:r>
-          </w:p>
-        </w:tc>
-        <w:tc>
-          <w:tcPr>
-            <w:tcW w:w="3137" w:type="dxa"/>
-          </w:tcPr>
-          <w:p>
-            <w:r>
-              <w:t>200 con token; 401 con clave mala o usuario inactivo</w:t>
+              <w:t>POST /api/v1/auth/token (OAuth2 password grant) y /api/v1/auth/login</w:t>
+            </w:r>
+          </w:p>
+        </w:tc>
+        <w:tc>
+          <w:tcPr>
+            <w:tcW w:w="3137" w:type="dxa"/>
+          </w:tcPr>
+          <w:p>
+            <w:r>
+              <w:t xml:space="preserve">200 con token y 16 scopes; 400 invalid_grant con clave mala; 403 insufficient_scope si al token le falta el permiso; el rol asigna los scopes </w:t>
+            </w:r>
+            <w:r>
+              <w:lastRenderedPageBreak/>
+              <w:t>(app/scopes.py)</w:t>
             </w:r>
           </w:p>
         </w:tc>
@@ -2468,6 +2532,7 @@
           </w:tcPr>
           <w:p>
             <w:r>
+              <w:lastRenderedPageBreak/>
               <w:t>Panel</w:t>
             </w:r>
           </w:p>
@@ -2584,7 +2649,7 @@
           </w:tcPr>
           <w:p>
             <w:r>
-              <w:t>listado y retirar OK; POST responde 500 (BUG-08, en arreglo)</w:t>
+              <w:t>los POST de matrículas quedaron cerrados (BUG-08) y verificados en el recorrido E2E</w:t>
             </w:r>
           </w:p>
         </w:tc>
@@ -2616,7 +2681,7 @@
           </w:tcPr>
           <w:p>
             <w:r>
-              <w:t>POST responde 500 (BUG-09, en arreglo); 403 por rol pendiente de esa corrección</w:t>
+              <w:t>los POST quedaron cerrados (BUG-09); 403 por rol implementado con scopes; solo admin ve la bitácora</w:t>
             </w:r>
           </w:p>
         </w:tc>
@@ -2649,6 +2714,38 @@
           <w:p>
             <w:r>
               <w:t>201/409/422 correctos; boleta del estudiante 1: curso 16.00 y promedio ponderado 13.43</w:t>
+            </w:r>
+          </w:p>
+        </w:tc>
+      </w:tr>
+      <w:tr>
+        <w:tc>
+          <w:tcPr>
+            <w:tcW w:w="3137" w:type="dxa"/>
+          </w:tcPr>
+          <w:p>
+            <w:r>
+              <w:t>Documental y caché (rúbrica)</w:t>
+            </w:r>
+          </w:p>
+        </w:tc>
+        <w:tc>
+          <w:tcPr>
+            <w:tcW w:w="3137" w:type="dxa"/>
+          </w:tcPr>
+          <w:p>
+            <w:r>
+              <w:t>GET /api/v1/auditoria, GET /estudiantes/{id}/boleta/archivada, POST /graphql</w:t>
+            </w:r>
+          </w:p>
+        </w:tc>
+        <w:tc>
+          <w:tcPr>
+            <w:tcW w:w="3137" w:type="dxa"/>
+          </w:tcPr>
+          <w:p>
+            <w:r>
+              <w:t>bitácora con 26 documentos reales (quién, qué, resultado y duración; contraseñas y tokens enmascarados); boleta archivada por estudiante y periodo; GraphQL responde la misma fórmula del promedio que el REST</w:t>
             </w:r>
           </w:p>
         </w:tc>
@@ -2663,7 +2760,7 @@
       <w:pPr>
         <w:pStyle w:val="Ttulo1"/>
       </w:pPr>
-      <w:bookmarkStart w:id="7" w:name="_Toc240924896"/>
+      <w:bookmarkStart w:id="7" w:name="_Toc242835871"/>
       <w:r>
         <w:t>6. Infraestructura e integración continua</w:t>
       </w:r>
@@ -2724,7 +2821,7 @@
           </w:tcPr>
           <w:p>
             <w:r>
-              <w:t>6 en total con el perfil obs: web (8080), api (8000), api-b, db (5432), prometheus (9090), grafana (3000)</w:t>
+              <w:t>8 servicios: web (80 en producción, 8080 en local), api (8000), api-b, db (5432), mongo (27017), redis (6379), prometheus (9090) y grafana (3000) — con el perfil «obs» para Loki</w:t>
             </w:r>
           </w:p>
         </w:tc>
@@ -2758,7 +2855,6 @@
           </w:tcPr>
           <w:p>
             <w:r>
-              <w:lastRenderedPageBreak/>
               <w:t>Failover</w:t>
             </w:r>
           </w:p>
@@ -2791,7 +2887,7 @@
           </w:tcPr>
           <w:p>
             <w:r>
-              <w:t>python scripts/verificar_stack.py → 9 comprobaciones OK, 0 fallas, exit 0</w:t>
+              <w:t>5 jobs en GitHub Actions, en verde en cada push a main: validación de infraestructura, backend (ruff + 121 pruebas con 90 % de cobertura), frontend (eslint + 25 pruebas + build), imágenes (build + humo) y la puerta final</w:t>
             </w:r>
           </w:p>
         </w:tc>
@@ -2813,7 +2909,11 @@
           </w:tcPr>
           <w:p>
             <w:r>
-              <w:t>python scripts/validar_infra.py → 21 comprobaciones OK, 0 fallas (es lo que corre el CI en cada pull request)</w:t>
+              <w:t xml:space="preserve">python scripts/validar_infra.py → 21 </w:t>
+            </w:r>
+            <w:r>
+              <w:lastRenderedPageBreak/>
+              <w:t>comprobaciones OK, 0 fallas (es lo que corre el CI en cada pull request)</w:t>
             </w:r>
           </w:p>
         </w:tc>
@@ -2825,6 +2925,7 @@
           </w:tcPr>
           <w:p>
             <w:r>
+              <w:lastRenderedPageBreak/>
               <w:t>CI</w:t>
             </w:r>
           </w:p>
@@ -2857,7 +2958,7 @@
           </w:tcPr>
           <w:p>
             <w:r>
-              <w:t>publica en GHCR con SBOM y provenance tras un CI verde en main; el despliegue a Kubernetes se activa con DEPLOY_ENABLED=true</w:t>
+              <w:t>tras el CI verde en main, Coolify reconstruye y despliega el stack en el VPS. Deploy real verificado el 14/10/2026: finished en 57 s, SPA React sirviendo, health 200, login 200 con 16 scopes y 20/20 llamadas al health sin fallos</w:t>
             </w:r>
           </w:p>
         </w:tc>
@@ -2865,14 +2966,14 @@
     </w:tbl>
     <w:p>
       <w:r>
-        <w:t>Honestidad sobre el estado: el CI y el CD están escritos y validados offline, pero todavía no han corrido nunca en GitHub porque el repositorio no tiene remoto configurado (T4.1). El compose del repositorio sigue sirviendo el arnés de humo con el que se validó la infraestructura antes de que existiera el código; integrar el API real al compose es T2.6.</w:t>
+        <w:t>Estado real de la integración continua: el repositorio es público (https://github.com/rarteagar/gs08-matriculas) y los cinco jobs corren en GitHub; el último commit (418f9c5) quedó con los cinco en verde. El despliegue es automático por Coolify desde main; en local, docker compose levanta el stack completo con el API real.</w:t>
       </w:r>
     </w:p>
     <w:p>
       <w:pPr>
         <w:pStyle w:val="Ttulo1"/>
       </w:pPr>
-      <w:bookmarkStart w:id="8" w:name="_Toc240924897"/>
+      <w:bookmarkStart w:id="8" w:name="_Toc242835872"/>
       <w:r>
         <w:t>7. Kubernetes local y observabilidad</w:t>
       </w:r>
@@ -2903,7 +3004,7 @@
       <w:pPr>
         <w:pStyle w:val="Ttulo1"/>
       </w:pPr>
-      <w:bookmarkStart w:id="9" w:name="_Toc240924898"/>
+      <w:bookmarkStart w:id="9" w:name="_Toc242835873"/>
       <w:r>
         <w:t>8. Calidad: criterios de aceptación y bugs</w:t>
       </w:r>
@@ -2911,7 +3012,7 @@
     </w:p>
     <w:p>
       <w:r>
-        <w:t>Los 39 criterios tienen matriz de trazabilidad con su caso de prueba y su estado real (docs/qa/plan-pruebas.md §3). El estado al 21/09/2026, con el API real:</w:t>
+        <w:t>Los 39 criterios tienen matriz de trazabilidad con su caso de prueba y su estado real (docs/qa/plan-pruebas.md §3). Estado al 14/10/2026, con el API real y la SPA desplegada:</w:t>
       </w:r>
     </w:p>
     <w:tbl>
@@ -2993,7 +3094,7 @@
           </w:tcPr>
           <w:p>
             <w:r>
-              <w:t>C-01, C-04 a C-11, C-13, C-14, C-18, C-19, C-24 a C-32 y C-35</w:t>
+              <w:t>los 39 criterios del alcance están cubiertos por el recorrido E2E del humo (39 OK, 0 fallas) y por las pruebas automatizadas: 121 del backend (90 % de cobertura) y 25 del SPA</w:t>
             </w:r>
           </w:p>
         </w:tc>
@@ -3015,17 +3116,17 @@
           </w:tcPr>
           <w:p>
             <w:r>
-              <w:t>4</w:t>
-            </w:r>
-          </w:p>
-        </w:tc>
-        <w:tc>
-          <w:tcPr>
-            <w:tcW w:w="3137" w:type="dxa"/>
-          </w:tcPr>
-          <w:p>
-            <w:r>
-              <w:t>C-16, C-17, C-22 y C-23 (los POST de matrículas y usuarios dan 500)</w:t>
+              <w:t>0</w:t>
+            </w:r>
+          </w:p>
+        </w:tc>
+        <w:tc>
+          <w:tcPr>
+            <w:tcW w:w="3137" w:type="dxa"/>
+          </w:tcPr>
+          <w:p>
+            <w:r>
+              <w:t>los dos 500 de los POST (BUG-08 y BUG-09) quedaron cerrados con la corrida verde; el resto de rechazos son 400, 401, 403, 409 o 422</w:t>
             </w:r>
           </w:p>
         </w:tc>
@@ -3057,7 +3158,11 @@
           </w:tcPr>
           <w:p>
             <w:r>
-              <w:t>C-33 (TC-01) y C-34 (TC-03), a cargo de DevOps y verificados por QA</w:t>
+              <w:t xml:space="preserve">C-33 (TC-01) y C-34 (TC-03), a cargo de DevOps y verificados </w:t>
+            </w:r>
+            <w:r>
+              <w:lastRenderedPageBreak/>
+              <w:t>por QA</w:t>
             </w:r>
           </w:p>
         </w:tc>
@@ -3069,32 +3174,28 @@
           </w:tcPr>
           <w:p>
             <w:r>
-              <w:t xml:space="preserve">Pendientes del guion de </w:t>
-            </w:r>
-            <w:r>
               <w:lastRenderedPageBreak/>
-              <w:t>interfaz</w:t>
-            </w:r>
-          </w:p>
-        </w:tc>
-        <w:tc>
-          <w:tcPr>
-            <w:tcW w:w="3137" w:type="dxa"/>
-          </w:tcPr>
-          <w:p>
-            <w:r>
-              <w:lastRenderedPageBreak/>
-              <w:t>6</w:t>
-            </w:r>
-          </w:p>
-        </w:tc>
-        <w:tc>
-          <w:tcPr>
-            <w:tcW w:w="3137" w:type="dxa"/>
-          </w:tcPr>
-          <w:p>
-            <w:r>
-              <w:t>necesitan el SPA (T2.4)</w:t>
+              <w:t>Pendientes del guion de interfaz</w:t>
+            </w:r>
+          </w:p>
+        </w:tc>
+        <w:tc>
+          <w:tcPr>
+            <w:tcW w:w="3137" w:type="dxa"/>
+          </w:tcPr>
+          <w:p>
+            <w:r>
+              <w:t>0</w:t>
+            </w:r>
+          </w:p>
+        </w:tc>
+        <w:tc>
+          <w:tcPr>
+            <w:tcW w:w="3137" w:type="dxa"/>
+          </w:tcPr>
+          <w:p>
+            <w:r>
+              <w:t>la SPA está construida y publicada (siete pantallas); el guion de interfaz completo se recorrió en el navegador</w:t>
             </w:r>
           </w:p>
         </w:tc>
@@ -3116,17 +3217,17 @@
           </w:tcPr>
           <w:p>
             <w:r>
-              <w:t>5</w:t>
-            </w:r>
-          </w:p>
-        </w:tc>
-        <w:tc>
-          <w:tcPr>
-            <w:tcW w:w="3137" w:type="dxa"/>
-          </w:tcPr>
-          <w:p>
-            <w:r>
-              <w:t>pytest, cluster (A-02), CI sin remoto y SPA</w:t>
+              <w:t>1</w:t>
+            </w:r>
+          </w:p>
+        </w:tc>
+        <w:tc>
+          <w:tcPr>
+            <w:tcW w:w="3137" w:type="dxa"/>
+          </w:tcPr>
+          <w:p>
+            <w:r>
+              <w:t>Kubernetes real sigue sin desplegar por la decisión de no instalar minikube en la máquina del grupo (A-02); los manifiestos validan con kubectl kustomize</w:t>
             </w:r>
           </w:p>
         </w:tc>
@@ -3134,7 +3235,7 @@
     </w:tbl>
     <w:p>
       <w:r>
-        <w:t>Probar encontró 9 bugs en total y 4 bugs en el propio script de pruebas. Los hallazgos incluyen un verificador de infraestructura que fallaba en un entorno recién levantado, un criterio que citaba un correo y un DNI que no existían en los datos, un /metrics que devolvía el index.html con 200, cabeceras de seguridad que no llegaban al API, la falta de la extensión unaccent y los dos 500 de esta ronda. El reporte completo, con pasos, esperado, obtenido, evidencia y estado, está en docs/qa/reporte-bugs.md.</w:t>
+        <w:t>Probar encontró 9 bugs en el sistema y 4 en los propios scripts de prueba; todos los del sistema quedaron cerrados con evidencia (docs/qa/reporte-bugs.md). La verificación final en el navegador agregó tres hallazgos que no aparecen con pruebas simuladas y quedaron corregidos (D-31): un fallo transitorio de MongoDB o Redis apagaba la bitácora o la caché para siempre en ese proceso (ahora se reintenta cada 30 s), la pantalla de Auditoría afirmaba «la bitácora está apagada» cuando en realidad la consulta había fallado, y una sesión vencida dejaba la pantalla en un estado falso (ahora un 401 olvida la sesión y vuelve al acceso).</w:t>
       </w:r>
     </w:p>
     <w:p>
@@ -3152,7 +3253,7 @@
       <w:pPr>
         <w:pStyle w:val="Ttulo1"/>
       </w:pPr>
-      <w:bookmarkStart w:id="10" w:name="_Toc240924899"/>
+      <w:bookmarkStart w:id="10" w:name="_Toc242835874"/>
       <w:r>
         <w:t>9. Seguridad, ética y sostenibilidad</w:t>
       </w:r>
@@ -3163,7 +3264,7 @@
         <w:pStyle w:val="Listaconvietas"/>
       </w:pPr>
       <w:r>
-        <w:t>Seguridad: bcrypt coste 10 y verificación del hash $2y$ del seed con la librería del API; roles admin y asistente con 403 por rol; 403 y 409 como contrato; 4 cabeceras de seguridad en nginx; ningún secreto en el repositorio (plantilla de Secret y .env ignorados); SBOM y provenance en GHCR; contenedores sin privilegios.</w:t>
+        <w:t>Seguridad: bcrypt coste 10 y verificación del hash $2y$ del seed; autenticación OAuth2 (password grant, RFC 6749 §4.3) con JWT que lleva 16 scopes por rol y autorización por scopes en cada operación (403 insufficient_scope con cabecera WWW-Authenticate); la bitácora enmascara contraseñas, claves y tokens antes de guardarlos («***»); cabeceras de seguridad en nginx; ningún secreto en el repositorio; SBOM y provenance en GHCR.</w:t>
       </w:r>
     </w:p>
     <w:p>
@@ -3202,7 +3303,7 @@
       <w:pPr>
         <w:pStyle w:val="Ttulo1"/>
       </w:pPr>
-      <w:bookmarkStart w:id="11" w:name="_Toc240924900"/>
+      <w:bookmarkStart w:id="11" w:name="_Toc242835875"/>
       <w:r>
         <w:t>10. Estado por sprint y bloqueos</w:t>
       </w:r>
@@ -3299,6 +3400,7 @@
           </w:tcPr>
           <w:p>
             <w:r>
+              <w:lastRenderedPageBreak/>
               <w:t>Sprint 1</w:t>
             </w:r>
           </w:p>
@@ -3319,7 +3421,7 @@
           </w:tcPr>
           <w:p>
             <w:r>
-              <w:t>En curso: API con 28 endpoints y 22 criterios verdes; dos 500 abiertos y cluster sin desplegar</w:t>
+              <w:t>Cerrado: API núcleo con contrato probado y los dos 500 de los POST cerrados</w:t>
             </w:r>
           </w:p>
         </w:tc>
@@ -3351,7 +3453,7 @@
           </w:tcPr>
           <w:p>
             <w:r>
-              <w:t>Endpoints escritos; el SPA no existe (T2.4)</w:t>
+              <w:t>Cerrado: matrículas, usuarios, notas y el SPA con siete pantallas (React 19)</w:t>
             </w:r>
           </w:p>
         </w:tc>
@@ -3383,7 +3485,7 @@
           </w:tcPr>
           <w:p>
             <w:r>
-              <w:t>Funcionando y verificado a mano; falta el recorrido completo, que hoy se corta en matrículas</w:t>
+              <w:t>Cerrado: notas y boleta, incluida la fórmula única de promedio ponderado que comparten REST y GraphQL</w:t>
             </w:r>
           </w:p>
         </w:tc>
@@ -3395,7 +3497,6 @@
           </w:tcPr>
           <w:p>
             <w:r>
-              <w:lastRenderedPageBreak/>
               <w:t>Sprint 4</w:t>
             </w:r>
           </w:p>
@@ -3416,7 +3517,7 @@
           </w:tcPr>
           <w:p>
             <w:r>
-              <w:t>Pendiente</w:t>
+              <w:t>Cerrado: bloque de rúbrica (MongoDB, Redis, GraphQL, OAuth2 con scopes, logging y accesibilidad), publicación en producción y documentación</w:t>
             </w:r>
           </w:p>
         </w:tc>
@@ -3424,7 +3525,7 @@
     </w:tbl>
     <w:p>
       <w:r>
-        <w:t>Bloqueos declarados: Kubernetes real (falta la aprobación para instalar minikube, A-02), repositorio público y CI sin ejecutar (T4.1), SPA (T2.4) y el recorrido de extremo a extremo (BUG-08). La fecha de entrega y de exposición sigue pendiente de confirmación (A-01).</w:t>
+        <w:t>Bloqueos y límites declarados: Kubernetes real sin desplegar por la decisión de no instalar minikube (A-02); Express.js queda como decisión abierta (A-04) — el API que se entrega es FastAPI, que cumple REST y GraphQL, y si el docente lo exige expresso hay un plan B de un día. El despliegue con mkcert/TLS local no se usó: la producción tiene certificado Let's Encrypt real.</w:t>
       </w:r>
     </w:p>
     <w:p>
@@ -3436,7 +3537,7 @@
       <w:pPr>
         <w:pStyle w:val="Ttulo1"/>
       </w:pPr>
-      <w:bookmarkStart w:id="12" w:name="_Toc240924901"/>
+      <w:bookmarkStart w:id="12" w:name="_Toc242835876"/>
       <w:r>
         <w:t>11. Conclusiones</w:t>
       </w:r>
@@ -3471,7 +3572,7 @@
         <w:pStyle w:val="Listaconvietas"/>
       </w:pPr>
       <w:r>
-        <w:t>Lo que sigue: cerrar los dos 500 de los POST (BUG-08 y BUG-09), completar la extensión unaccent en la migración de Alembic, desplegar el cluster cuando se apruebe minikube, construir el SPA y correr el recorrido completo de la matrícula a la nota.</w:t>
+        <w:t>Lo que sigue, si el curso continúa: desplegar también el stack en Kubernetes cuando se instale minikube, correr pruebas de carga sobre la caché y sumar la boleta archivada a los reportes del panel.</w:t>
       </w:r>
     </w:p>
     <w:p>
@@ -3483,12 +3584,338 @@
       <w:pPr>
         <w:pStyle w:val="Ttulo1"/>
       </w:pPr>
-      <w:bookmarkStart w:id="13" w:name="_Toc240924902"/>
+      <w:bookmarkStart w:id="13" w:name="_Toc242835877"/>
       <w:r>
         <w:lastRenderedPageBreak/>
+        <w:t>12. Capa de rúbrica del API y accesibilidad del SPA (D-28 a D-31)</w:t>
+      </w:r>
+      <w:bookmarkEnd w:id="13"/>
+    </w:p>
+    <w:p>
+      <w:r>
+        <w:t>La consigna del trabajo colaborativo pide, además del sistema, cinco piezas concretas: bases de datos híbridas (PostgreSQL + MongoDB), APIs REST y GraphQL, autenticación y autorización con OAuth2, JWT y roles RBAC, caché distribuida (Redis) con logging centralizado, y criterios de UX/UI inclusivo (WCAG, ARIA) documentados con Storybook. Todas están implementadas sobre el mismo núcleo y verificadas contra el stack real; esta sección dice dónde está cada una y con qué se comprueba.</w:t>
+      </w:r>
+    </w:p>
+    <w:tbl>
+      <w:tblPr>
+        <w:tblStyle w:val="Tablaconcuadrcula"/>
+        <w:tblW w:w="0" w:type="auto"/>
+        <w:tblLook w:val="04A0" w:firstRow="1" w:lastRow="0" w:firstColumn="1" w:lastColumn="0" w:noHBand="0" w:noVBand="1"/>
+      </w:tblPr>
+      <w:tblGrid>
+        <w:gridCol w:w="3137"/>
+        <w:gridCol w:w="3137"/>
+        <w:gridCol w:w="3137"/>
+      </w:tblGrid>
+      <w:tr>
+        <w:tc>
+          <w:tcPr>
+            <w:tcW w:w="3137" w:type="dxa"/>
+          </w:tcPr>
+          <w:p>
+            <w:r>
+              <w:t>Ítem de la consigna</w:t>
+            </w:r>
+          </w:p>
+        </w:tc>
+        <w:tc>
+          <w:tcPr>
+            <w:tcW w:w="3137" w:type="dxa"/>
+          </w:tcPr>
+          <w:p>
+            <w:r>
+              <w:t>Qué existe hoy</w:t>
+            </w:r>
+          </w:p>
+        </w:tc>
+        <w:tc>
+          <w:tcPr>
+            <w:tcW w:w="3137" w:type="dxa"/>
+          </w:tcPr>
+          <w:p>
+            <w:r>
+              <w:t>Cómo se comprueba</w:t>
+            </w:r>
+          </w:p>
+        </w:tc>
+      </w:tr>
+      <w:tr>
+        <w:tc>
+          <w:tcPr>
+            <w:tcW w:w="3137" w:type="dxa"/>
+          </w:tcPr>
+          <w:p>
+            <w:r>
+              <w:t>Bases de datos híbridas (PostgreSQL + MongoDB)</w:t>
+            </w:r>
+          </w:p>
+        </w:tc>
+        <w:tc>
+          <w:tcPr>
+            <w:tcW w:w="3137" w:type="dxa"/>
+          </w:tcPr>
+          <w:p>
+            <w:r>
+              <w:t>Bitácora documental de todas las escrituras (usuario, acción, entidad, resultado, duración y petición) y boletas archivadas, en la base gs08_bitacora; lectura solo para admin con GET /api/v1/auditoria y la pantalla «Auditoría» del SPA</w:t>
+            </w:r>
+          </w:p>
+        </w:tc>
+        <w:tc>
+          <w:tcPr>
+            <w:tcW w:w="3137" w:type="dxa"/>
+          </w:tcPr>
+          <w:p>
+            <w:r>
+              <w:t>26 documentos reales tras el recorrido; activa:true en las dos instancias del API en producción</w:t>
+            </w:r>
+          </w:p>
+        </w:tc>
+      </w:tr>
+      <w:tr>
+        <w:tc>
+          <w:tcPr>
+            <w:tcW w:w="3137" w:type="dxa"/>
+          </w:tcPr>
+          <w:p>
+            <w:r>
+              <w:t>APIs REST y GraphQL</w:t>
+            </w:r>
+          </w:p>
+        </w:tc>
+        <w:tc>
+          <w:tcPr>
+            <w:tcW w:w="3137" w:type="dxa"/>
+          </w:tcPr>
+          <w:p>
+            <w:r>
+              <w:t>REST (20 rutas / 35 operaciones, OpenAPI v0.3.0) y GraphQL en /graphql con GraphiQL; la consulta de boleta comparte una sola fórmula de promedio ponderado con el REST (app/boleta.py)</w:t>
+            </w:r>
+          </w:p>
+        </w:tc>
+        <w:tc>
+          <w:tcPr>
+            <w:tcW w:w="3137" w:type="dxa"/>
+          </w:tcPr>
+          <w:p>
+            <w:r>
+              <w:t>/graphql responde 200 en producción; la consulta devuelve el mismo promedio que el REST</w:t>
+            </w:r>
+          </w:p>
+        </w:tc>
+      </w:tr>
+      <w:tr>
+        <w:tc>
+          <w:tcPr>
+            <w:tcW w:w="3137" w:type="dxa"/>
+          </w:tcPr>
+          <w:p>
+            <w:r>
+              <w:t>OAuth2, JWT y roles RBAC</w:t>
+            </w:r>
+          </w:p>
+        </w:tc>
+        <w:tc>
+          <w:tcPr>
+            <w:tcW w:w="3137" w:type="dxa"/>
+          </w:tcPr>
+          <w:p>
+            <w:r>
+              <w:t>POST /api/v1/auth/token con password grant (RFC 6749 §4.3), 16 scopes repartidos por rol, 403 insufficient_scope con WWW-Authenticate, botón Authorize en Swagger y /auth/login como alias JSON del SPA</w:t>
+            </w:r>
+          </w:p>
+        </w:tc>
+        <w:tc>
+          <w:tcPr>
+            <w:tcW w:w="3137" w:type="dxa"/>
+          </w:tcPr>
+          <w:p>
+            <w:r>
+              <w:t>token de admin con 16 scopes; token restringido a un permiso: GET 200 y POST 403; errores estándar (invalid_grant, invalid_scope, unsupported_grant_type)</w:t>
+            </w:r>
+          </w:p>
+        </w:tc>
+      </w:tr>
+      <w:tr>
+        <w:tc>
+          <w:tcPr>
+            <w:tcW w:w="3137" w:type="dxa"/>
+          </w:tcPr>
+          <w:p>
+            <w:r>
+              <w:t>Caché distribuida (Redis)</w:t>
+            </w:r>
+          </w:p>
+        </w:tc>
+        <w:tc>
+          <w:tcPr>
+            <w:tcW w:w="3137" w:type="dxa"/>
+          </w:tcPr>
+          <w:p>
+            <w:r>
+              <w:t>Caché del panel en Redis (clave gs08:panel, TTL 60 s) invalidada en cada escritura desde el middleware</w:t>
+            </w:r>
+          </w:p>
+        </w:tc>
+        <w:tc>
+          <w:tcPr>
+            <w:tcW w:w="3137" w:type="dxa"/>
+          </w:tcPr>
+          <w:p>
+            <w:r>
+              <w:t>panel 54,2 ms → 13,5 ms (4,0×) con 20 000 estudiantes y 20 000 matrículas sembradas</w:t>
+            </w:r>
+          </w:p>
+        </w:tc>
+      </w:tr>
+      <w:tr>
+        <w:tc>
+          <w:tcPr>
+            <w:tcW w:w="3137" w:type="dxa"/>
+          </w:tcPr>
+          <w:p>
+            <w:r>
+              <w:t>Logging centralizado</w:t>
+            </w:r>
+          </w:p>
+        </w:tc>
+        <w:tc>
+          <w:tcPr>
+            <w:tcW w:w="3137" w:type="dxa"/>
+          </w:tcPr>
+          <w:p>
+            <w:r>
+              <w:t>Logs JSON con identificador de petición, usuario, ruta, estado y duración; envío opcional a Loki y tablero en Grafana</w:t>
+            </w:r>
+          </w:p>
+        </w:tc>
+        <w:tc>
+          <w:tcPr>
+            <w:tcW w:w="3137" w:type="dxa"/>
+          </w:tcPr>
+          <w:p>
+            <w:r>
+              <w:t>serie {servicio="gs08-api"} en Loki; 3 targets up en Prometheus</w:t>
+            </w:r>
+          </w:p>
+        </w:tc>
+      </w:tr>
+      <w:tr>
+        <w:tc>
+          <w:tcPr>
+            <w:tcW w:w="3137" w:type="dxa"/>
+          </w:tcPr>
+          <w:p>
+            <w:r>
+              <w:t>UX/UI inclusivo (WCAG, ARIA)</w:t>
+            </w:r>
+          </w:p>
+        </w:tc>
+        <w:tc>
+          <w:tcPr>
+            <w:tcW w:w="3137" w:type="dxa"/>
+          </w:tcPr>
+          <w:p>
+            <w:r>
+              <w:t>Foco atrapado en los diálogos, enlace «Saltar al contenido», aria-current en el menú, caption y scope en las tablas, aria-busy en las cargas, foco siempre visible y respeto por prefers-reduced-motion</w:t>
+            </w:r>
+          </w:p>
+        </w:tc>
+        <w:tc>
+          <w:tcPr>
+            <w:tcW w:w="3137" w:type="dxa"/>
+          </w:tcPr>
+          <w:p>
+            <w:r>
+              <w:t>25 pruebas del SPA con axe-core; contraste calculado sobre el CSS compilado: 14/14 pares cumplen AA (4.5:1) y el anillo de foco 5.93:1</w:t>
+            </w:r>
+          </w:p>
+        </w:tc>
+      </w:tr>
+      <w:tr>
+        <w:tc>
+          <w:tcPr>
+            <w:tcW w:w="3137" w:type="dxa"/>
+          </w:tcPr>
+          <w:p>
+            <w:r>
+              <w:t>Documentación con Storybook</w:t>
+            </w:r>
+          </w:p>
+        </w:tc>
+        <w:tc>
+          <w:tcPr>
+            <w:tcW w:w="3137" w:type="dxa"/>
+          </w:tcPr>
+          <w:p>
+            <w:r>
+              <w:t xml:space="preserve">21 historias en cinco grupos (avisos, diálogos, tabla, boleta, notas y bitácora) con documentación automática de </w:t>
+            </w:r>
+            <w:r>
+              <w:lastRenderedPageBreak/>
+              <w:t>cada componente</w:t>
+            </w:r>
+          </w:p>
+        </w:tc>
+        <w:tc>
+          <w:tcPr>
+            <w:tcW w:w="3137" w:type="dxa"/>
+          </w:tcPr>
+          <w:p>
+            <w:r>
+              <w:lastRenderedPageBreak/>
+              <w:t>npm run build-storybook construye el sitio estático sin errores</w:t>
+            </w:r>
+          </w:p>
+        </w:tc>
+      </w:tr>
+      <w:tr>
+        <w:tc>
+          <w:tcPr>
+            <w:tcW w:w="3137" w:type="dxa"/>
+          </w:tcPr>
+          <w:p>
+            <w:r>
+              <w:t>Publicación en la nube</w:t>
+            </w:r>
+          </w:p>
+        </w:tc>
+        <w:tc>
+          <w:tcPr>
+            <w:tcW w:w="3137" w:type="dxa"/>
+          </w:tcPr>
+          <w:p>
+            <w:r>
+              <w:t>El stack completo corre en el VPS del grupo con HTTPS: SPA React, dos instancias del API y las bases relacional y documental, con la caché</w:t>
+            </w:r>
+          </w:p>
+        </w:tc>
+        <w:tc>
+          <w:tcPr>
+            <w:tcW w:w="3137" w:type="dxa"/>
+          </w:tcPr>
+          <w:p>
+            <w:r>
+              <w:t>deploy del 14/10/2026 (finished en 57 s): SPA React sirviendo, health 200, login 200 con 16 scopes, bitácora activa y 20/20 llamadas al health sin fallos</w:t>
+            </w:r>
+          </w:p>
+        </w:tc>
+      </w:tr>
+    </w:tbl>
+    <w:p>
+      <w:r>
+        <w:t>Migración del SPA (D-27): la consigna pide interfaces con React, así que la SPA que estaba en Vue 3 se migró a React 19 conservando el diseño y el contrato del API — no fue una reescritura del sistema. Del bloque de rúbrica, lo único que no se implementó es la firma de Express.js para el API (A-04): el API entregado es FastAPI y cumple REST y GraphQL; queda anotado como plan B de un día si el docente lo exige expresso.</w:t>
+      </w:r>
+    </w:p>
+    <w:p/>
+    <w:p>
+      <w:pPr>
+        <w:pStyle w:val="Ttulo1"/>
+      </w:pPr>
+      <w:bookmarkStart w:id="14" w:name="_Toc242835878"/>
+      <w:r>
         <w:t>Firma grupal</w:t>
       </w:r>
-      <w:bookmarkEnd w:id="13"/>
+      <w:bookmarkEnd w:id="14"/>
     </w:p>
     <w:p>
       <w:r>
@@ -3684,16 +4111,16 @@
       <w:pPr>
         <w:pStyle w:val="Ttulo1"/>
       </w:pPr>
-      <w:bookmarkStart w:id="14" w:name="_Toc240924903"/>
+      <w:bookmarkStart w:id="15" w:name="_Toc242835879"/>
       <w:r>
         <w:lastRenderedPageBreak/>
         <w:t>Anexo A. Cómo se reproduce todo lo que dice este informe</w:t>
       </w:r>
-      <w:bookmarkEnd w:id="14"/>
+      <w:bookmarkEnd w:id="15"/>
     </w:p>
     <w:p>
       <w:r>
-        <w:t>Todos los comandos se ejecutan desde D:\dev\equipo\gs08-matriculas.</w:t>
+        <w:t>Todos los comandos se ejecutan desde la raíz del repositorio (https://github.com/rarteagar/gs08-matriculas).</w:t>
       </w:r>
     </w:p>
     <w:tbl>
@@ -3703,9 +4130,9 @@
         <w:tblLook w:val="04A0" w:firstRow="1" w:lastRow="0" w:firstColumn="1" w:lastColumn="0" w:noHBand="0" w:noVBand="1"/>
       </w:tblPr>
       <w:tblGrid>
-        <w:gridCol w:w="2970"/>
-        <w:gridCol w:w="3675"/>
-        <w:gridCol w:w="2983"/>
+        <w:gridCol w:w="2913"/>
+        <w:gridCol w:w="3785"/>
+        <w:gridCol w:w="2930"/>
       </w:tblGrid>
       <w:tr>
         <w:tc>
@@ -3861,7 +4288,7 @@
           </w:tcPr>
           <w:p>
             <w:r>
-              <w:t>docker exec -i gs08-analista-verif psql -q -U gs08 -d gs08_matriculas &lt; db/verificacion/verificar_modelo.sql</w:t>
+              <w:t>… &lt; db/verificacion/verificar_modelo.sql (por el contenedor gs08-db)</w:t>
             </w:r>
           </w:p>
         </w:tc>
@@ -3957,17 +4384,113 @@
           </w:tcPr>
           <w:p>
             <w:r>
-              <w:t>bash scripts/smoke_api.sh --solo-contrato --e2e --url http://localhost:8010</w:t>
-            </w:r>
-          </w:p>
-        </w:tc>
-        <w:tc>
-          <w:tcPr>
-            <w:tcW w:w="3137" w:type="dxa"/>
-          </w:tcPr>
-          <w:p>
-            <w:r>
-              <w:t>matriz de los 39 criterios con su estado</w:t>
+              <w:t>bash scripts/smoke_api.sh --solo-contrato --e2e --url http://localhost:8080</w:t>
+            </w:r>
+          </w:p>
+        </w:tc>
+        <w:tc>
+          <w:tcPr>
+            <w:tcW w:w="3137" w:type="dxa"/>
+          </w:tcPr>
+          <w:p>
+            <w:r>
+              <w:t>matriz de los 39 criterios con su estado, por el proxy</w:t>
+            </w:r>
+          </w:p>
+        </w:tc>
+      </w:tr>
+      <w:tr>
+        <w:tc>
+          <w:tcPr>
+            <w:tcW w:w="2970" w:type="dxa"/>
+          </w:tcPr>
+          <w:p>
+            <w:r>
+              <w:t>API: pruebas y cobertura</w:t>
+            </w:r>
+          </w:p>
+        </w:tc>
+        <w:tc>
+          <w:tcPr>
+            <w:tcW w:w="3675" w:type="dxa"/>
+          </w:tcPr>
+          <w:p>
+            <w:r>
+              <w:t>pytest -q --cov=app --cov-fail-under=60</w:t>
+            </w:r>
+          </w:p>
+        </w:tc>
+        <w:tc>
+          <w:tcPr>
+            <w:tcW w:w="2983" w:type="dxa"/>
+          </w:tcPr>
+          <w:p>
+            <w:r>
+              <w:t>121 pruebas OK, 90 % de cobertura</w:t>
+            </w:r>
+          </w:p>
+        </w:tc>
+      </w:tr>
+      <w:tr>
+        <w:tc>
+          <w:tcPr>
+            <w:tcW w:w="2970" w:type="dxa"/>
+          </w:tcPr>
+          <w:p>
+            <w:r>
+              <w:t>SPA: pruebas y accesibilidad</w:t>
+            </w:r>
+          </w:p>
+        </w:tc>
+        <w:tc>
+          <w:tcPr>
+            <w:tcW w:w="3675" w:type="dxa"/>
+          </w:tcPr>
+          <w:p>
+            <w:r>
+              <w:t>npm run test:unit (frontend/)</w:t>
+            </w:r>
+          </w:p>
+        </w:tc>
+        <w:tc>
+          <w:tcPr>
+            <w:tcW w:w="2983" w:type="dxa"/>
+          </w:tcPr>
+          <w:p>
+            <w:r>
+              <w:t>25 pruebas OK (incluida la batería de axe-core)</w:t>
+            </w:r>
+          </w:p>
+        </w:tc>
+      </w:tr>
+      <w:tr>
+        <w:tc>
+          <w:tcPr>
+            <w:tcW w:w="2970" w:type="dxa"/>
+          </w:tcPr>
+          <w:p>
+            <w:r>
+              <w:t>Producción</w:t>
+            </w:r>
+          </w:p>
+        </w:tc>
+        <w:tc>
+          <w:tcPr>
+            <w:tcW w:w="3675" w:type="dxa"/>
+          </w:tcPr>
+          <w:p>
+            <w:r>
+              <w:t>curl -s -o /dev/null -w '%{http_code}' https://gs08-matriculas.mlarca.com/api/v1/health</w:t>
+            </w:r>
+          </w:p>
+        </w:tc>
+        <w:tc>
+          <w:tcPr>
+            <w:tcW w:w="2983" w:type="dxa"/>
+          </w:tcPr>
+          <w:p>
+            <w:r>
+              <w:t>200 en producción (y 20 llamadas seguidas sin fallos)</w:t>
             </w:r>
           </w:p>
         </w:tc>
@@ -4022,7 +4545,7 @@
       <w:pStyle w:val="Piedepgina"/>
     </w:pPr>
     <w:r>
-      <w:t xml:space="preserve">Generado el 21/09/2026 · borrador armado por @documentador · la versión académica final la cierra el grupo (D-22)Page </w:t>
+      <w:t xml:space="preserve">Actualizado el 14/10/2026 · documento armado por @documentador · la versión académica final y la firma las cierra el grupo (D-22) · Página </w:t>
     </w:r>
     <w:r>
       <w:fldChar w:fldCharType="begin"/>
@@ -4040,7 +4563,7 @@
       <w:fldChar w:fldCharType="end"/>
     </w:r>
     <w:r>
-      <w:t xml:space="preserve"> of </w:t>
+      <w:t xml:space="preserve"> de </w:t>
     </w:r>
     <w:r>
       <w:fldChar w:fldCharType="begin"/>
@@ -4093,7 +4616,7 @@
       <w:pStyle w:val="Encabezado"/>
     </w:pPr>
     <w:r>
-      <w:t>GS08 · Matrículas y Notas — Informe del proyecto (BORRADOR)</w:t>
+      <w:t>GS08 · Matrículas y Notas — Informe del proyecto · v2 (14/10/2026)</w:t>
     </w:r>
   </w:p>
 </w:hdr>

</xml_diff>

<commit_message>
docs(informe): anexo B con las instrucciones para ejecutar el sistema en otra computadora
El Word del informe explica requisitos, los cuatro pasos (Docker, descomprimir,
ejecutar.bat, abrir el navegador), el acceso de demostracion, el recorrido
sugerido de 5 minutos, como detenerlo y que hacer si algo no arranca. El PDF y el
ZIP de entrega quedan regenerados (13 paginas).
</commit_message>
<xml_diff>
--- a/docs/informe/informe-gs08-matriculas-2026-09-21.docx
+++ b/docs/informe/informe-gs08-matriculas-2026-09-21.docx
@@ -6,7 +6,7 @@
       <w:pPr>
         <w:pStyle w:val="Ttulo1"/>
       </w:pPr>
-      <w:bookmarkStart w:id="0" w:name="_Toc243310947"/>
+      <w:bookmarkStart w:id="0" w:name="_Toc243311558"/>
       <w:r>
         <w:t>GS08 · Matrículas y Notas</w:t>
       </w:r>
@@ -228,7 +228,7 @@
       <w:pPr>
         <w:pStyle w:val="Ttulo2"/>
       </w:pPr>
-      <w:bookmarkStart w:id="1" w:name="_Toc243310948"/>
+      <w:bookmarkStart w:id="1" w:name="_Toc243311559"/>
       <w:r>
         <w:t>Índice</w:t>
       </w:r>
@@ -258,7 +258,7 @@
       <w:r>
         <w:fldChar w:fldCharType="separate"/>
       </w:r>
-      <w:hyperlink w:anchor="_Toc243310947" w:history="1">
+      <w:hyperlink w:anchor="_Toc243311558" w:history="1">
         <w:r>
           <w:rPr>
             <w:rStyle w:val="Hipervnculo"/>
@@ -285,7 +285,7 @@
             <w:noProof/>
             <w:webHidden/>
           </w:rPr>
-          <w:instrText xml:space="preserve"> PAGEREF _Toc243310947 \h </w:instrText>
+          <w:instrText xml:space="preserve"> PAGEREF _Toc243311558 \h </w:instrText>
         </w:r>
         <w:r>
           <w:rPr>
@@ -331,7 +331,7 @@
           <w14:ligatures w14:val="standardContextual"/>
         </w:rPr>
       </w:pPr>
-      <w:hyperlink w:anchor="_Toc243310948" w:history="1">
+      <w:hyperlink w:anchor="_Toc243311559" w:history="1">
         <w:r>
           <w:rPr>
             <w:rStyle w:val="Hipervnculo"/>
@@ -358,7 +358,7 @@
             <w:noProof/>
             <w:webHidden/>
           </w:rPr>
-          <w:instrText xml:space="preserve"> PAGEREF _Toc243310948 \h </w:instrText>
+          <w:instrText xml:space="preserve"> PAGEREF _Toc243311559 \h </w:instrText>
         </w:r>
         <w:r>
           <w:rPr>
@@ -404,7 +404,7 @@
           <w14:ligatures w14:val="standardContextual"/>
         </w:rPr>
       </w:pPr>
-      <w:hyperlink w:anchor="_Toc243310949" w:history="1">
+      <w:hyperlink w:anchor="_Toc243311560" w:history="1">
         <w:r>
           <w:rPr>
             <w:rStyle w:val="Hipervnculo"/>
@@ -431,7 +431,7 @@
             <w:noProof/>
             <w:webHidden/>
           </w:rPr>
-          <w:instrText xml:space="preserve"> PAGEREF _Toc243310949 \h </w:instrText>
+          <w:instrText xml:space="preserve"> PAGEREF _Toc243311560 \h </w:instrText>
         </w:r>
         <w:r>
           <w:rPr>
@@ -477,7 +477,7 @@
           <w14:ligatures w14:val="standardContextual"/>
         </w:rPr>
       </w:pPr>
-      <w:hyperlink w:anchor="_Toc243310950" w:history="1">
+      <w:hyperlink w:anchor="_Toc243311561" w:history="1">
         <w:r>
           <w:rPr>
             <w:rStyle w:val="Hipervnculo"/>
@@ -504,7 +504,7 @@
             <w:noProof/>
             <w:webHidden/>
           </w:rPr>
-          <w:instrText xml:space="preserve"> PAGEREF _Toc243310950 \h </w:instrText>
+          <w:instrText xml:space="preserve"> PAGEREF _Toc243311561 \h </w:instrText>
         </w:r>
         <w:r>
           <w:rPr>
@@ -550,7 +550,7 @@
           <w14:ligatures w14:val="standardContextual"/>
         </w:rPr>
       </w:pPr>
-      <w:hyperlink w:anchor="_Toc243310951" w:history="1">
+      <w:hyperlink w:anchor="_Toc243311562" w:history="1">
         <w:r>
           <w:rPr>
             <w:rStyle w:val="Hipervnculo"/>
@@ -577,7 +577,7 @@
             <w:noProof/>
             <w:webHidden/>
           </w:rPr>
-          <w:instrText xml:space="preserve"> PAGEREF _Toc243310951 \h </w:instrText>
+          <w:instrText xml:space="preserve"> PAGEREF _Toc243311562 \h </w:instrText>
         </w:r>
         <w:r>
           <w:rPr>
@@ -623,7 +623,7 @@
           <w14:ligatures w14:val="standardContextual"/>
         </w:rPr>
       </w:pPr>
-      <w:hyperlink w:anchor="_Toc243310952" w:history="1">
+      <w:hyperlink w:anchor="_Toc243311563" w:history="1">
         <w:r>
           <w:rPr>
             <w:rStyle w:val="Hipervnculo"/>
@@ -650,7 +650,7 @@
             <w:noProof/>
             <w:webHidden/>
           </w:rPr>
-          <w:instrText xml:space="preserve"> PAGEREF _Toc243310952 \h </w:instrText>
+          <w:instrText xml:space="preserve"> PAGEREF _Toc243311563 \h </w:instrText>
         </w:r>
         <w:r>
           <w:rPr>
@@ -696,7 +696,7 @@
           <w14:ligatures w14:val="standardContextual"/>
         </w:rPr>
       </w:pPr>
-      <w:hyperlink w:anchor="_Toc243310953" w:history="1">
+      <w:hyperlink w:anchor="_Toc243311564" w:history="1">
         <w:r>
           <w:rPr>
             <w:rStyle w:val="Hipervnculo"/>
@@ -723,7 +723,7 @@
             <w:noProof/>
             <w:webHidden/>
           </w:rPr>
-          <w:instrText xml:space="preserve"> PAGEREF _Toc243310953 \h </w:instrText>
+          <w:instrText xml:space="preserve"> PAGEREF _Toc243311564 \h </w:instrText>
         </w:r>
         <w:r>
           <w:rPr>
@@ -769,7 +769,7 @@
           <w14:ligatures w14:val="standardContextual"/>
         </w:rPr>
       </w:pPr>
-      <w:hyperlink w:anchor="_Toc243310954" w:history="1">
+      <w:hyperlink w:anchor="_Toc243311565" w:history="1">
         <w:r>
           <w:rPr>
             <w:rStyle w:val="Hipervnculo"/>
@@ -796,7 +796,7 @@
             <w:noProof/>
             <w:webHidden/>
           </w:rPr>
-          <w:instrText xml:space="preserve"> PAGEREF _Toc243310954 \h </w:instrText>
+          <w:instrText xml:space="preserve"> PAGEREF _Toc243311565 \h </w:instrText>
         </w:r>
         <w:r>
           <w:rPr>
@@ -842,7 +842,7 @@
           <w14:ligatures w14:val="standardContextual"/>
         </w:rPr>
       </w:pPr>
-      <w:hyperlink w:anchor="_Toc243310955" w:history="1">
+      <w:hyperlink w:anchor="_Toc243311566" w:history="1">
         <w:r>
           <w:rPr>
             <w:rStyle w:val="Hipervnculo"/>
@@ -869,7 +869,7 @@
             <w:noProof/>
             <w:webHidden/>
           </w:rPr>
-          <w:instrText xml:space="preserve"> PAGEREF _Toc243310955 \h </w:instrText>
+          <w:instrText xml:space="preserve"> PAGEREF _Toc243311566 \h </w:instrText>
         </w:r>
         <w:r>
           <w:rPr>
@@ -915,7 +915,7 @@
           <w14:ligatures w14:val="standardContextual"/>
         </w:rPr>
       </w:pPr>
-      <w:hyperlink w:anchor="_Toc243310956" w:history="1">
+      <w:hyperlink w:anchor="_Toc243311567" w:history="1">
         <w:r>
           <w:rPr>
             <w:rStyle w:val="Hipervnculo"/>
@@ -942,7 +942,7 @@
             <w:noProof/>
             <w:webHidden/>
           </w:rPr>
-          <w:instrText xml:space="preserve"> PAGEREF _Toc243310956 \h </w:instrText>
+          <w:instrText xml:space="preserve"> PAGEREF _Toc243311567 \h </w:instrText>
         </w:r>
         <w:r>
           <w:rPr>
@@ -988,7 +988,7 @@
           <w14:ligatures w14:val="standardContextual"/>
         </w:rPr>
       </w:pPr>
-      <w:hyperlink w:anchor="_Toc243310957" w:history="1">
+      <w:hyperlink w:anchor="_Toc243311568" w:history="1">
         <w:r>
           <w:rPr>
             <w:rStyle w:val="Hipervnculo"/>
@@ -1015,7 +1015,7 @@
             <w:noProof/>
             <w:webHidden/>
           </w:rPr>
-          <w:instrText xml:space="preserve"> PAGEREF _Toc243310957 \h </w:instrText>
+          <w:instrText xml:space="preserve"> PAGEREF _Toc243311568 \h </w:instrText>
         </w:r>
         <w:r>
           <w:rPr>
@@ -1061,7 +1061,7 @@
           <w14:ligatures w14:val="standardContextual"/>
         </w:rPr>
       </w:pPr>
-      <w:hyperlink w:anchor="_Toc243310958" w:history="1">
+      <w:hyperlink w:anchor="_Toc243311569" w:history="1">
         <w:r>
           <w:rPr>
             <w:rStyle w:val="Hipervnculo"/>
@@ -1088,7 +1088,7 @@
             <w:noProof/>
             <w:webHidden/>
           </w:rPr>
-          <w:instrText xml:space="preserve"> PAGEREF _Toc243310958 \h </w:instrText>
+          <w:instrText xml:space="preserve"> PAGEREF _Toc243311569 \h </w:instrText>
         </w:r>
         <w:r>
           <w:rPr>
@@ -1134,7 +1134,7 @@
           <w14:ligatures w14:val="standardContextual"/>
         </w:rPr>
       </w:pPr>
-      <w:hyperlink w:anchor="_Toc243310959" w:history="1">
+      <w:hyperlink w:anchor="_Toc243311570" w:history="1">
         <w:r>
           <w:rPr>
             <w:rStyle w:val="Hipervnculo"/>
@@ -1161,7 +1161,7 @@
             <w:noProof/>
             <w:webHidden/>
           </w:rPr>
-          <w:instrText xml:space="preserve"> PAGEREF _Toc243310959 \h </w:instrText>
+          <w:instrText xml:space="preserve"> PAGEREF _Toc243311570 \h </w:instrText>
         </w:r>
         <w:r>
           <w:rPr>
@@ -1207,7 +1207,7 @@
           <w14:ligatures w14:val="standardContextual"/>
         </w:rPr>
       </w:pPr>
-      <w:hyperlink w:anchor="_Toc243310960" w:history="1">
+      <w:hyperlink w:anchor="_Toc243311571" w:history="1">
         <w:r>
           <w:rPr>
             <w:rStyle w:val="Hipervnculo"/>
@@ -1234,7 +1234,7 @@
             <w:noProof/>
             <w:webHidden/>
           </w:rPr>
-          <w:instrText xml:space="preserve"> PAGEREF _Toc243310960 \h </w:instrText>
+          <w:instrText xml:space="preserve"> PAGEREF _Toc243311571 \h </w:instrText>
         </w:r>
         <w:r>
           <w:rPr>
@@ -1280,7 +1280,7 @@
           <w14:ligatures w14:val="standardContextual"/>
         </w:rPr>
       </w:pPr>
-      <w:hyperlink w:anchor="_Toc243310961" w:history="1">
+      <w:hyperlink w:anchor="_Toc243311572" w:history="1">
         <w:r>
           <w:rPr>
             <w:rStyle w:val="Hipervnculo"/>
@@ -1307,7 +1307,7 @@
             <w:noProof/>
             <w:webHidden/>
           </w:rPr>
-          <w:instrText xml:space="preserve"> PAGEREF _Toc243310961 \h </w:instrText>
+          <w:instrText xml:space="preserve"> PAGEREF _Toc243311572 \h </w:instrText>
         </w:r>
         <w:r>
           <w:rPr>
@@ -1353,7 +1353,7 @@
           <w14:ligatures w14:val="standardContextual"/>
         </w:rPr>
       </w:pPr>
-      <w:hyperlink w:anchor="_Toc243310962" w:history="1">
+      <w:hyperlink w:anchor="_Toc243311573" w:history="1">
         <w:r>
           <w:rPr>
             <w:rStyle w:val="Hipervnculo"/>
@@ -1380,7 +1380,80 @@
             <w:noProof/>
             <w:webHidden/>
           </w:rPr>
-          <w:instrText xml:space="preserve"> PAGEREF _Toc243310962 \h </w:instrText>
+          <w:instrText xml:space="preserve"> PAGEREF _Toc243311573 \h </w:instrText>
+        </w:r>
+        <w:r>
+          <w:rPr>
+            <w:noProof/>
+            <w:webHidden/>
+          </w:rPr>
+        </w:r>
+        <w:r>
+          <w:rPr>
+            <w:noProof/>
+            <w:webHidden/>
+          </w:rPr>
+          <w:fldChar w:fldCharType="separate"/>
+        </w:r>
+        <w:r>
+          <w:rPr>
+            <w:noProof/>
+            <w:webHidden/>
+          </w:rPr>
+          <w:t>12</w:t>
+        </w:r>
+        <w:r>
+          <w:rPr>
+            <w:noProof/>
+            <w:webHidden/>
+          </w:rPr>
+          <w:fldChar w:fldCharType="end"/>
+        </w:r>
+      </w:hyperlink>
+    </w:p>
+    <w:p>
+      <w:pPr>
+        <w:pStyle w:val="TDC1"/>
+        <w:tabs>
+          <w:tab w:val="right" w:leader="dot" w:pos="9402"/>
+        </w:tabs>
+        <w:rPr>
+          <w:noProof/>
+          <w:kern w:val="2"/>
+          <w:sz w:val="24"/>
+          <w:szCs w:val="24"/>
+          <w:lang w:val="es-PE" w:eastAsia="es-PE"/>
+          <w14:ligatures w14:val="standardContextual"/>
+        </w:rPr>
+      </w:pPr>
+      <w:hyperlink w:anchor="_Toc243311574" w:history="1">
+        <w:r>
+          <w:rPr>
+            <w:rStyle w:val="Hipervnculo"/>
+            <w:noProof/>
+          </w:rPr>
+          <w:t>Anexo B. Cómo ejecutar el sistema en otra computadora</w:t>
+        </w:r>
+        <w:r>
+          <w:rPr>
+            <w:noProof/>
+            <w:webHidden/>
+          </w:rPr>
+          <w:tab/>
+        </w:r>
+        <w:r>
+          <w:rPr>
+            <w:noProof/>
+            <w:webHidden/>
+          </w:rPr>
+          <w:fldChar w:fldCharType="begin"/>
+        </w:r>
+        <w:r>
+          <w:rPr>
+            <w:noProof/>
+            <w:webHidden/>
+          </w:rPr>
+          <w:instrText xml:space="preserve"> PAGEREF _Toc243311574 \h </w:instrText>
         </w:r>
         <w:r>
           <w:rPr>
@@ -1425,7 +1498,7 @@
       <w:pPr>
         <w:pStyle w:val="Ttulo1"/>
       </w:pPr>
-      <w:bookmarkStart w:id="2" w:name="_Toc243310949"/>
+      <w:bookmarkStart w:id="2" w:name="_Toc243311560"/>
       <w:r>
         <w:lastRenderedPageBreak/>
         <w:t>1. Resumen ejecutivo</w:t>
@@ -1454,7 +1527,7 @@
       <w:pPr>
         <w:pStyle w:val="Ttulo1"/>
       </w:pPr>
-      <w:bookmarkStart w:id="3" w:name="_Toc243310950"/>
+      <w:bookmarkStart w:id="3" w:name="_Toc243311561"/>
       <w:r>
         <w:t>2. Problema y alcance</w:t>
       </w:r>
@@ -1822,7 +1895,7 @@
       <w:pPr>
         <w:pStyle w:val="Ttulo1"/>
       </w:pPr>
-      <w:bookmarkStart w:id="4" w:name="_Toc243310951"/>
+      <w:bookmarkStart w:id="4" w:name="_Toc243311562"/>
       <w:r>
         <w:t>3. Arquitectura y stack</w:t>
       </w:r>
@@ -2124,7 +2197,7 @@
       <w:pPr>
         <w:pStyle w:val="Ttulo1"/>
       </w:pPr>
-      <w:bookmarkStart w:id="5" w:name="_Toc243310952"/>
+      <w:bookmarkStart w:id="5" w:name="_Toc243311563"/>
       <w:r>
         <w:t>4. Modelo de datos y reglas de negocio</w:t>
       </w:r>
@@ -2400,7 +2473,7 @@
       <w:pPr>
         <w:pStyle w:val="Ttulo1"/>
       </w:pPr>
-      <w:bookmarkStart w:id="6" w:name="_Toc243310953"/>
+      <w:bookmarkStart w:id="6" w:name="_Toc243311564"/>
       <w:r>
         <w:t>5. API: contrato y comportamiento</w:t>
       </w:r>
@@ -2760,7 +2833,7 @@
       <w:pPr>
         <w:pStyle w:val="Ttulo1"/>
       </w:pPr>
-      <w:bookmarkStart w:id="7" w:name="_Toc243310954"/>
+      <w:bookmarkStart w:id="7" w:name="_Toc243311565"/>
       <w:r>
         <w:t>6. Infraestructura e integración continua</w:t>
       </w:r>
@@ -2973,7 +3046,7 @@
       <w:pPr>
         <w:pStyle w:val="Ttulo1"/>
       </w:pPr>
-      <w:bookmarkStart w:id="8" w:name="_Toc243310955"/>
+      <w:bookmarkStart w:id="8" w:name="_Toc243311566"/>
       <w:r>
         <w:t>7. Kubernetes local y observabilidad</w:t>
       </w:r>
@@ -3001,7 +3074,7 @@
       <w:pPr>
         <w:pStyle w:val="Ttulo1"/>
       </w:pPr>
-      <w:bookmarkStart w:id="9" w:name="_Toc243310956"/>
+      <w:bookmarkStart w:id="9" w:name="_Toc243311567"/>
       <w:r>
         <w:t>8. Calidad: criterios de aceptación y bugs</w:t>
       </w:r>
@@ -3250,7 +3323,7 @@
       <w:pPr>
         <w:pStyle w:val="Ttulo1"/>
       </w:pPr>
-      <w:bookmarkStart w:id="10" w:name="_Toc243310957"/>
+      <w:bookmarkStart w:id="10" w:name="_Toc243311568"/>
       <w:r>
         <w:t>9. Seguridad, ética y sostenibilidad</w:t>
       </w:r>
@@ -3300,7 +3373,7 @@
       <w:pPr>
         <w:pStyle w:val="Ttulo1"/>
       </w:pPr>
-      <w:bookmarkStart w:id="11" w:name="_Toc243310958"/>
+      <w:bookmarkStart w:id="11" w:name="_Toc243311569"/>
       <w:r>
         <w:t>10. Estado por sprint y bloqueos</w:t>
       </w:r>
@@ -3534,7 +3607,7 @@
       <w:pPr>
         <w:pStyle w:val="Ttulo1"/>
       </w:pPr>
-      <w:bookmarkStart w:id="12" w:name="_Toc243310959"/>
+      <w:bookmarkStart w:id="12" w:name="_Toc243311570"/>
       <w:r>
         <w:t>11. Conclusiones</w:t>
       </w:r>
@@ -3581,7 +3654,7 @@
       <w:pPr>
         <w:pStyle w:val="Ttulo1"/>
       </w:pPr>
-      <w:bookmarkStart w:id="13" w:name="_Toc243310960"/>
+      <w:bookmarkStart w:id="13" w:name="_Toc243311571"/>
       <w:r>
         <w:lastRenderedPageBreak/>
         <w:t>12. Capa de rúbrica del API y accesibilidad del SPA (D-28 a D-31)</w:t>
@@ -3908,7 +3981,7 @@
       <w:pPr>
         <w:pStyle w:val="Ttulo1"/>
       </w:pPr>
-      <w:bookmarkStart w:id="14" w:name="_Toc243310961"/>
+      <w:bookmarkStart w:id="14" w:name="_Toc243311572"/>
       <w:r>
         <w:t>Firma grupal</w:t>
       </w:r>
@@ -4074,7 +4147,7 @@
       <w:pPr>
         <w:pStyle w:val="Ttulo1"/>
       </w:pPr>
-      <w:bookmarkStart w:id="15" w:name="_Toc243310962"/>
+      <w:bookmarkStart w:id="15" w:name="_Toc243311573"/>
       <w:r>
         <w:lastRenderedPageBreak/>
         <w:t>Anexo A. Cómo se reproduce todo lo que dice este informe</w:t>
@@ -4462,6 +4535,294 @@
     <w:p>
       <w:r>
         <w:t>Documentos fuente: docs/alcance-mvp.md · docs/backlog-sprints.md · docs/decisiones.md · docs/arquitectura.md · docs/manual-tecnico.md · docs/seguridad-etica-sostenibilidad.md · docs/analisis/modelo-datos.md · docs/analisis/datos-seed.md · docs/devops/evidencia-sprint0.md · docs/devops/plan-contenedores-ci.md · docs/qa/plan-pruebas.md · docs/qa/reporte-bugs.md · docs/actas/acta-sprint-0.md · docs/actas/retrospectiva-sprint-0.md.</w:t>
+      </w:r>
+    </w:p>
+    <w:p>
+      <w:pPr>
+        <w:pStyle w:val="Ttulo1"/>
+      </w:pPr>
+      <w:bookmarkStart w:id="16" w:name="_Toc243311574"/>
+      <w:r>
+        <w:t>Anexo B. Cómo ejecutar el sistema en otra computadora</w:t>
+      </w:r>
+      <w:bookmarkEnd w:id="16"/>
+    </w:p>
+    <w:p>
+      <w:r>
+        <w:t>El sistema se entrega también como un paquete que se ejecuta en cualquier computadora con Docker, sin depender de internet ni de un servidor. Es la misma aplicación que está publicada en línea, con las bases de datos y los datos de demostración incluidos.</w:t>
+      </w:r>
+    </w:p>
+    <w:p>
+      <w:r>
+        <w:rPr>
+          <w:b/>
+        </w:rPr>
+        <w:t>Requisitos</w:t>
+      </w:r>
+    </w:p>
+    <w:p>
+      <w:pPr>
+        <w:pStyle w:val="Listaconvietas"/>
+      </w:pPr>
+      <w:r>
+        <w:t xml:space="preserve">Windows 10 u 11 (también funciona en macOS o Linux con </w:t>
+      </w:r>
+      <w:r>
+        <w:t>Docker).</w:t>
+      </w:r>
+    </w:p>
+    <w:p>
+      <w:pPr>
+        <w:pStyle w:val="Listaconvietas"/>
+      </w:pPr>
+      <w:r>
+        <w:t>Docker Desktop instalado y abierto; es gratuito y se descarga en https://www.docker.com/products/docker-desktop/.</w:t>
+      </w:r>
+    </w:p>
+    <w:p>
+      <w:pPr>
+        <w:pStyle w:val="Listaconvietas"/>
+      </w:pPr>
+      <w:r>
+        <w:t>4 GB de memoria libre y unos 5 minutos la primera vez (las siguientes arranca en menos de un minuto).</w:t>
+      </w:r>
+    </w:p>
+    <w:p>
+      <w:r>
+        <w:rPr>
+          <w:b/>
+        </w:rPr>
+        <w:t>Pasos</w:t>
+      </w:r>
+    </w:p>
+    <w:p>
+      <w:pPr>
+        <w:pStyle w:val="Listaconnmeros"/>
+      </w:pPr>
+      <w:r>
+        <w:t>Instalar Docker Desktop y abrirlo hasta que indique «Engine running».</w:t>
+      </w:r>
+    </w:p>
+    <w:p>
+      <w:pPr>
+        <w:pStyle w:val="Listaconnmeros"/>
+      </w:pPr>
+      <w:r>
+        <w:t>Descomprimir el archivo GS08 - Matriculas y Notas - Para ejecutar.zip en una carpeta.</w:t>
+      </w:r>
+    </w:p>
+    <w:p>
+      <w:pPr>
+        <w:pStyle w:val="Listaconnmeros"/>
+      </w:pPr>
+      <w:r>
+        <w:lastRenderedPageBreak/>
+        <w:t>Hacer doble clic en ejecutar.bat: construye el sistema, espera a que responda y abre el navegador.</w:t>
+      </w:r>
+    </w:p>
+    <w:p>
+      <w:pPr>
+        <w:pStyle w:val="Listaconnmeros"/>
+      </w:pPr>
+      <w:r>
+        <w:t>Si el navegador no se abre, entrar manualmente a http://localhost:8080.</w:t>
+      </w:r>
+    </w:p>
+    <w:p>
+      <w:r>
+        <w:rPr>
+          <w:b/>
+        </w:rPr>
+        <w:t>Acceso de demostración</w:t>
+      </w:r>
+    </w:p>
+    <w:tbl>
+      <w:tblPr>
+        <w:tblStyle w:val="Tablaconcuadrcula"/>
+        <w:tblW w:w="0" w:type="auto"/>
+        <w:tblLook w:val="04A0" w:firstRow="1" w:lastRow="0" w:firstColumn="1" w:lastColumn="0" w:noHBand="0" w:noVBand="1"/>
+      </w:tblPr>
+      <w:tblGrid>
+        <w:gridCol w:w="4706"/>
+        <w:gridCol w:w="4706"/>
+      </w:tblGrid>
+      <w:tr>
+        <w:tc>
+          <w:tcPr>
+            <w:tcW w:w="4706" w:type="dxa"/>
+          </w:tcPr>
+          <w:p>
+            <w:r>
+              <w:t>Campo</w:t>
+            </w:r>
+          </w:p>
+        </w:tc>
+        <w:tc>
+          <w:tcPr>
+            <w:tcW w:w="4706" w:type="dxa"/>
+          </w:tcPr>
+          <w:p>
+            <w:r>
+              <w:t>Valor</w:t>
+            </w:r>
+          </w:p>
+        </w:tc>
+      </w:tr>
+      <w:tr>
+        <w:tc>
+          <w:tcPr>
+            <w:tcW w:w="4706" w:type="dxa"/>
+          </w:tcPr>
+          <w:p>
+            <w:r>
+              <w:t>Usuario</w:t>
+            </w:r>
+          </w:p>
+        </w:tc>
+        <w:tc>
+          <w:tcPr>
+            <w:tcW w:w="4706" w:type="dxa"/>
+          </w:tcPr>
+          <w:p>
+            <w:r>
+              <w:t>admin (o admin@horizonte.edu.pe)</w:t>
+            </w:r>
+          </w:p>
+        </w:tc>
+      </w:tr>
+      <w:tr>
+        <w:tc>
+          <w:tcPr>
+            <w:tcW w:w="4706" w:type="dxa"/>
+          </w:tcPr>
+          <w:p>
+            <w:r>
+              <w:t>Contraseña</w:t>
+            </w:r>
+          </w:p>
+        </w:tc>
+        <w:tc>
+          <w:tcPr>
+            <w:tcW w:w="4706" w:type="dxa"/>
+          </w:tcPr>
+          <w:p>
+            <w:r>
+              <w:t>Admin123!</w:t>
+            </w:r>
+          </w:p>
+        </w:tc>
+      </w:tr>
+    </w:tbl>
+    <w:p>
+      <w:r>
+        <w:rPr>
+          <w:b/>
+        </w:rPr>
+        <w:t>Recorrido sugerido para la revisión (5 minutos)</w:t>
+      </w:r>
+    </w:p>
+    <w:p>
+      <w:pPr>
+        <w:pStyle w:val="Listaconvietas"/>
+      </w:pPr>
+      <w:r>
+        <w:t>Panel: los cuatro indicadores del sistema.</w:t>
+      </w:r>
+    </w:p>
+    <w:p>
+      <w:pPr>
+        <w:pStyle w:val="Listaconvietas"/>
+      </w:pPr>
+      <w:r>
+        <w:t>Estudiantes: buscar «huaman» y comprobar que encuentra «Huamán» (ignora tildes y mayúsculas).</w:t>
+      </w:r>
+    </w:p>
+    <w:p>
+      <w:pPr>
+        <w:pStyle w:val="Listaconvietas"/>
+      </w:pPr>
+      <w:r>
+        <w:t>Matrículas: crear una, registrar tres notas y abrir la boleta con el promedio ponderado por créditos.</w:t>
+      </w:r>
+    </w:p>
+    <w:p>
+      <w:pPr>
+        <w:pStyle w:val="Listaconvietas"/>
+      </w:pPr>
+      <w:r>
+        <w:t xml:space="preserve">Cursos y Usuarios: alta, edición y baja lógica, con confirmación en los </w:t>
+      </w:r>
+      <w:r>
+        <w:t>borrados.</w:t>
+      </w:r>
+    </w:p>
+    <w:p>
+      <w:pPr>
+        <w:pStyle w:val="Listaconvietas"/>
+      </w:pPr>
+      <w:r>
+        <w:t>Auditoría (solo administrador): la bitácora de cada operación y la consulta de una boleta archivada.</w:t>
+      </w:r>
+    </w:p>
+    <w:p>
+      <w:pPr>
+        <w:pStyle w:val="Listaconvietas"/>
+      </w:pPr>
+      <w:r>
+        <w:t>API: http://localhost:8000/docs (Swagger) y http://localhost:8000/graphql (GraphiQL).</w:t>
+      </w:r>
+    </w:p>
+    <w:p>
+      <w:r>
+        <w:rPr>
+          <w:b/>
+        </w:rPr>
+        <w:t>Para detener el sistema</w:t>
+      </w:r>
+    </w:p>
+    <w:p>
+      <w:r>
+        <w:t xml:space="preserve">Doble clic en </w:t>
+      </w:r>
+      <w:r>
+        <w:t>detener.bat. Los datos se conservan: al volver a ejecutar, el sistema queda como se dejó. Si se quiere empezar de cero, se borra el volumen con docker compose down -v.</w:t>
+      </w:r>
+    </w:p>
+    <w:p>
+      <w:r>
+        <w:rPr>
+          <w:b/>
+        </w:rPr>
+        <w:t>Si algo no arranca</w:t>
+      </w:r>
+    </w:p>
+    <w:p>
+      <w:pPr>
+        <w:pStyle w:val="Listaconvietas"/>
+      </w:pPr>
+      <w:r>
+        <w:t>«Docker está instalado pero no está iniciado»: abrir Docker Desktop, esperar a «Engine running» y repetir.</w:t>
+      </w:r>
+    </w:p>
+    <w:p>
+      <w:pPr>
+        <w:pStyle w:val="Listaconvietas"/>
+      </w:pPr>
+      <w:r>
+        <w:t>El puerto 8080 está ocupado: crear un archivo .env junto a docker-compose.yml con la línea WEB_PORT=8090 y entrar a http://localhost:8090.</w:t>
+      </w:r>
+    </w:p>
+    <w:p>
+      <w:pPr>
+        <w:pStyle w:val="Listaconvietas"/>
+      </w:pPr>
+      <w:r>
+        <w:t>Para ver qué pasó: docker compose logs --tail 60 en la carpeta del proyecto.</w:t>
+      </w:r>
+    </w:p>
+    <w:p>
+      <w:r>
+        <w:t>El sistema también está publicado en https://gs08-matriculas.mlarca.com con las mismas credenciales, disponible hasta el 02/11/2026 (D-34). La ventaja de ejecutarlo en la propia computadora es que funciona sin conexión y permite probar altas y bajas sin afectar la demostración publicada.</w:t>
       </w:r>
     </w:p>
     <w:sectPr>

</xml_diff>